<commit_message>
Word parte 3 (falta parte 2)
</commit_message>
<xml_diff>
--- a/TP 2/BigData_TP2_Grupo#4 .docx
+++ b/TP 2/BigData_TP2_Grupo#4 .docx
@@ -1,6 +1,6 @@
 
 <file path=word/document.xml><?xml version="1.0" encoding="utf-8"?>
-<w:document xmlns:wpc="http://schemas.microsoft.com/office/word/2010/wordprocessingCanvas" xmlns:cx="http://schemas.microsoft.com/office/drawing/2014/chartex" xmlns:cx1="http://schemas.microsoft.com/office/drawing/2015/9/8/chartex" xmlns:cx2="http://schemas.microsoft.com/office/drawing/2015/10/21/chartex" xmlns:cx3="http://schemas.microsoft.com/office/drawing/2016/5/9/chartex" xmlns:cx4="http://schemas.microsoft.com/office/drawing/2016/5/10/chartex" xmlns:cx5="http://schemas.microsoft.com/office/drawing/2016/5/11/chartex" xmlns:cx6="http://schemas.microsoft.com/office/drawing/2016/5/12/chartex" xmlns:cx7="http://schemas.microsoft.com/office/drawing/2016/5/13/chartex" xmlns:cx8="http://schemas.microsoft.com/office/drawing/2016/5/14/chartex" xmlns:mc="http://schemas.openxmlformats.org/markup-compatibility/2006" xmlns:aink="http://schemas.microsoft.com/office/drawing/2016/ink" xmlns:am3d="http://schemas.microsoft.com/office/drawing/2017/model3d" xmlns:o="urn:schemas-microsoft-com:office:office" xmlns:oel="http://schemas.microsoft.com/office/2019/extlst" xmlns:r="http://schemas.openxmlformats.org/officeDocument/2006/relationships" xmlns:m="http://schemas.openxmlformats.org/officeDocument/2006/math" xmlns:v="urn:schemas-microsoft-com:vml" xmlns:wp14="http://schemas.microsoft.com/office/word/2010/wordprocessingDrawing" xmlns:wp="http://schemas.openxmlformats.org/drawingml/2006/wordprocessingDrawing" xmlns:w10="urn:schemas-microsoft-com:office:word" xmlns:w="http://schemas.openxmlformats.org/wordprocessingml/2006/main" xmlns:w14="http://schemas.microsoft.com/office/word/2010/wordml" xmlns:w15="http://schemas.microsoft.com/office/word/2012/wordml" xmlns:w16cex="http://schemas.microsoft.com/office/word/2018/wordml/cex" xmlns:w16cid="http://schemas.microsoft.com/office/word/2016/wordml/cid" xmlns:w16="http://schemas.microsoft.com/office/word/2018/wordml" xmlns:w16sdtdh="http://schemas.microsoft.com/office/word/2020/wordml/sdtdatahash" xmlns:w16se="http://schemas.microsoft.com/office/word/2015/wordml/symex" xmlns:wpg="http://schemas.microsoft.com/office/word/2010/wordprocessingGroup" xmlns:wpi="http://schemas.microsoft.com/office/word/2010/wordprocessingInk" xmlns:wne="http://schemas.microsoft.com/office/word/2006/wordml" xmlns:wps="http://schemas.microsoft.com/office/word/2010/wordprocessingShape" mc:Ignorable="w14 w15 w16se w16cid w16 w16cex w16sdtdh wp14">
+<w:document xmlns:wpc="http://schemas.microsoft.com/office/word/2010/wordprocessingCanvas" xmlns:cx="http://schemas.microsoft.com/office/drawing/2014/chartex" xmlns:cx1="http://schemas.microsoft.com/office/drawing/2015/9/8/chartex" xmlns:cx2="http://schemas.microsoft.com/office/drawing/2015/10/21/chartex" xmlns:cx3="http://schemas.microsoft.com/office/drawing/2016/5/9/chartex" xmlns:cx4="http://schemas.microsoft.com/office/drawing/2016/5/10/chartex" xmlns:cx5="http://schemas.microsoft.com/office/drawing/2016/5/11/chartex" xmlns:cx6="http://schemas.microsoft.com/office/drawing/2016/5/12/chartex" xmlns:cx7="http://schemas.microsoft.com/office/drawing/2016/5/13/chartex" xmlns:cx8="http://schemas.microsoft.com/office/drawing/2016/5/14/chartex" xmlns:mc="http://schemas.openxmlformats.org/markup-compatibility/2006" xmlns:aink="http://schemas.microsoft.com/office/drawing/2016/ink" xmlns:am3d="http://schemas.microsoft.com/office/drawing/2017/model3d" xmlns:o="urn:schemas-microsoft-com:office:office" xmlns:r="http://schemas.openxmlformats.org/officeDocument/2006/relationships" xmlns:m="http://schemas.openxmlformats.org/officeDocument/2006/math" xmlns:v="urn:schemas-microsoft-com:vml" xmlns:wp14="http://schemas.microsoft.com/office/word/2010/wordprocessingDrawing" xmlns:wp="http://schemas.openxmlformats.org/drawingml/2006/wordprocessingDrawing" xmlns:w10="urn:schemas-microsoft-com:office:word" xmlns:w="http://schemas.openxmlformats.org/wordprocessingml/2006/main" xmlns:w14="http://schemas.microsoft.com/office/word/2010/wordml" xmlns:w15="http://schemas.microsoft.com/office/word/2012/wordml" xmlns:w16cex="http://schemas.microsoft.com/office/word/2018/wordml/cex" xmlns:w16cid="http://schemas.microsoft.com/office/word/2016/wordml/cid" xmlns:w16="http://schemas.microsoft.com/office/word/2018/wordml" xmlns:w16sdtdh="http://schemas.microsoft.com/office/word/2020/wordml/sdtdatahash" xmlns:w16se="http://schemas.microsoft.com/office/word/2015/wordml/symex" xmlns:wpg="http://schemas.microsoft.com/office/word/2010/wordprocessingGroup" xmlns:wpi="http://schemas.microsoft.com/office/word/2010/wordprocessingInk" xmlns:wne="http://schemas.microsoft.com/office/word/2006/wordml" xmlns:wps="http://schemas.microsoft.com/office/word/2010/wordprocessingShape" mc:Ignorable="w14 w15 w16se w16cid w16 w16cex w16sdtdh wp14">
   <w:body>
     <w:p>
       <w:pPr>
@@ -742,7 +742,6 @@
           <w:rFonts w:ascii="Times New Roman" w:eastAsia="Century Schoolbook" w:hAnsi="Times New Roman" w:cs="Times New Roman"/>
           <w:sz w:val="22"/>
           <w:szCs w:val="22"/>
-          <w:lang w:val="es-US"/>
         </w:rPr>
       </w:pPr>
       <w:r>
@@ -2169,7 +2168,7 @@
       <w:pPr>
         <w:numPr>
           <w:ilvl w:val="0"/>
-          <w:numId w:val="2"/>
+          <w:numId w:val="7"/>
         </w:numPr>
         <w:pBdr>
           <w:top w:val="nil"/>
@@ -2202,7 +2201,7 @@
       <w:pPr>
         <w:numPr>
           <w:ilvl w:val="0"/>
-          <w:numId w:val="2"/>
+          <w:numId w:val="7"/>
         </w:numPr>
         <w:pBdr>
           <w:top w:val="nil"/>
@@ -2334,7 +2333,7 @@
       <w:pPr>
         <w:numPr>
           <w:ilvl w:val="0"/>
-          <w:numId w:val="2"/>
+          <w:numId w:val="7"/>
         </w:numPr>
         <w:pBdr>
           <w:top w:val="nil"/>
@@ -2438,7 +2437,7 @@
       <w:pPr>
         <w:numPr>
           <w:ilvl w:val="0"/>
-          <w:numId w:val="2"/>
+          <w:numId w:val="7"/>
         </w:numPr>
         <w:spacing w:before="240" w:after="0" w:line="240" w:lineRule="auto"/>
         <w:jc w:val="both"/>
@@ -2573,7 +2572,7 @@
       <w:pPr>
         <w:numPr>
           <w:ilvl w:val="0"/>
-          <w:numId w:val="2"/>
+          <w:numId w:val="7"/>
         </w:numPr>
         <w:spacing w:before="240" w:after="0" w:line="240" w:lineRule="auto"/>
         <w:jc w:val="both"/>
@@ -2658,7 +2657,7 @@
       <w:pPr>
         <w:numPr>
           <w:ilvl w:val="0"/>
-          <w:numId w:val="2"/>
+          <w:numId w:val="7"/>
         </w:numPr>
         <w:spacing w:after="0" w:line="240" w:lineRule="auto"/>
         <w:jc w:val="both"/>
@@ -2705,6 +2704,286 @@
     </w:p>
     <w:p>
       <w:pPr>
+        <w:pStyle w:val="Prrafodelista"/>
+        <w:rPr>
+          <w:rFonts w:ascii="Century Schoolbook" w:eastAsia="Century Schoolbook" w:hAnsi="Century Schoolbook" w:cs="Century Schoolbook"/>
+          <w:lang w:val="es-US"/>
+        </w:rPr>
+      </w:pPr>
+    </w:p>
+    <w:p>
+      <w:pPr>
+        <w:spacing w:after="0" w:line="240" w:lineRule="auto"/>
+        <w:ind w:left="502" w:firstLine="0"/>
+        <w:jc w:val="both"/>
+        <w:rPr>
+          <w:rFonts w:ascii="Century Schoolbook" w:eastAsia="Century Schoolbook" w:hAnsi="Century Schoolbook" w:cs="Century Schoolbook"/>
+          <w:lang w:val="es-US"/>
+        </w:rPr>
+      </w:pPr>
+      <w:r>
+        <w:rPr>
+          <w:rFonts w:ascii="Century Schoolbook" w:eastAsia="Century Schoolbook" w:hAnsi="Century Schoolbook" w:cs="Century Schoolbook"/>
+          <w:lang w:val="es-US"/>
+        </w:rPr>
+        <w:t xml:space="preserve">En </w:t>
+      </w:r>
+      <w:r>
+        <w:rPr>
+          <w:rFonts w:ascii="Century Schoolbook" w:eastAsia="Century Schoolbook" w:hAnsi="Century Schoolbook" w:cs="Century Schoolbook"/>
+          <w:b/>
+          <w:bCs/>
+          <w:lang w:val="es-US"/>
+        </w:rPr>
+        <w:t>2005</w:t>
+      </w:r>
+      <w:r>
+        <w:rPr>
+          <w:rFonts w:ascii="Century Schoolbook" w:eastAsia="Century Schoolbook" w:hAnsi="Century Schoolbook" w:cs="Century Schoolbook"/>
+          <w:lang w:val="es-US"/>
+        </w:rPr>
+        <w:t xml:space="preserve"> se identificaron </w:t>
+      </w:r>
+      <w:r>
+        <w:rPr>
+          <w:rFonts w:ascii="Century Schoolbook" w:eastAsia="Century Schoolbook" w:hAnsi="Century Schoolbook" w:cs="Century Schoolbook"/>
+          <w:b/>
+          <w:bCs/>
+          <w:lang w:val="es-US"/>
+        </w:rPr>
+        <w:t>228 pobres</w:t>
+      </w:r>
+      <w:r>
+        <w:rPr>
+          <w:rFonts w:ascii="Century Schoolbook" w:eastAsia="Century Schoolbook" w:hAnsi="Century Schoolbook" w:cs="Century Schoolbook"/>
+          <w:lang w:val="es-US"/>
+        </w:rPr>
+        <w:t xml:space="preserve">, lo que representa el </w:t>
+      </w:r>
+      <w:r>
+        <w:rPr>
+          <w:rFonts w:ascii="Century Schoolbook" w:eastAsia="Century Schoolbook" w:hAnsi="Century Schoolbook" w:cs="Century Schoolbook"/>
+          <w:b/>
+          <w:bCs/>
+          <w:lang w:val="es-US"/>
+        </w:rPr>
+        <w:t>9,79% de la muestra</w:t>
+      </w:r>
+      <w:r>
+        <w:rPr>
+          <w:rFonts w:ascii="Century Schoolbook" w:eastAsia="Century Schoolbook" w:hAnsi="Century Schoolbook" w:cs="Century Schoolbook"/>
+          <w:lang w:val="es-US"/>
+        </w:rPr>
+        <w:t>.</w:t>
+      </w:r>
+    </w:p>
+    <w:p>
+      <w:pPr>
+        <w:spacing w:after="0" w:line="240" w:lineRule="auto"/>
+        <w:ind w:left="502" w:firstLine="0"/>
+        <w:jc w:val="both"/>
+        <w:rPr>
+          <w:rFonts w:ascii="Century Schoolbook" w:eastAsia="Century Schoolbook" w:hAnsi="Century Schoolbook" w:cs="Century Schoolbook"/>
+          <w:lang w:val="es-US"/>
+        </w:rPr>
+      </w:pPr>
+      <w:r>
+        <w:rPr>
+          <w:rFonts w:ascii="Century Schoolbook" w:eastAsia="Century Schoolbook" w:hAnsi="Century Schoolbook" w:cs="Century Schoolbook"/>
+          <w:lang w:val="es-US"/>
+        </w:rPr>
+        <w:t xml:space="preserve">En </w:t>
+      </w:r>
+      <w:r>
+        <w:rPr>
+          <w:rFonts w:ascii="Century Schoolbook" w:eastAsia="Century Schoolbook" w:hAnsi="Century Schoolbook" w:cs="Century Schoolbook"/>
+          <w:b/>
+          <w:bCs/>
+          <w:lang w:val="es-US"/>
+        </w:rPr>
+        <w:t>2025</w:t>
+      </w:r>
+      <w:r>
+        <w:rPr>
+          <w:rFonts w:ascii="Century Schoolbook" w:eastAsia="Century Schoolbook" w:hAnsi="Century Schoolbook" w:cs="Century Schoolbook"/>
+          <w:lang w:val="es-US"/>
+        </w:rPr>
+        <w:t xml:space="preserve"> se identificaron </w:t>
+      </w:r>
+      <w:r>
+        <w:rPr>
+          <w:rFonts w:ascii="Century Schoolbook" w:eastAsia="Century Schoolbook" w:hAnsi="Century Schoolbook" w:cs="Century Schoolbook"/>
+          <w:b/>
+          <w:bCs/>
+          <w:lang w:val="es-US"/>
+        </w:rPr>
+        <w:t>127 pobres</w:t>
+      </w:r>
+      <w:r>
+        <w:rPr>
+          <w:rFonts w:ascii="Century Schoolbook" w:eastAsia="Century Schoolbook" w:hAnsi="Century Schoolbook" w:cs="Century Schoolbook"/>
+          <w:lang w:val="es-US"/>
+        </w:rPr>
+        <w:t xml:space="preserve">, lo que representa el </w:t>
+      </w:r>
+      <w:r>
+        <w:rPr>
+          <w:rFonts w:ascii="Century Schoolbook" w:eastAsia="Century Schoolbook" w:hAnsi="Century Schoolbook" w:cs="Century Schoolbook"/>
+          <w:b/>
+          <w:bCs/>
+          <w:lang w:val="es-US"/>
+        </w:rPr>
+        <w:t>13,67% de la muestra</w:t>
+      </w:r>
+      <w:r>
+        <w:rPr>
+          <w:rFonts w:ascii="Century Schoolbook" w:eastAsia="Century Schoolbook" w:hAnsi="Century Schoolbook" w:cs="Century Schoolbook"/>
+          <w:lang w:val="es-US"/>
+        </w:rPr>
+        <w:t xml:space="preserve">. </w:t>
+      </w:r>
+    </w:p>
+    <w:p>
+      <w:pPr>
+        <w:spacing w:after="0" w:line="240" w:lineRule="auto"/>
+        <w:ind w:left="502" w:firstLine="0"/>
+        <w:jc w:val="both"/>
+        <w:rPr>
+          <w:rFonts w:ascii="Century Schoolbook" w:eastAsia="Century Schoolbook" w:hAnsi="Century Schoolbook" w:cs="Century Schoolbook"/>
+          <w:lang w:val="es-US"/>
+        </w:rPr>
+      </w:pPr>
+      <w:r>
+        <w:rPr>
+          <w:rFonts w:ascii="Century Schoolbook" w:eastAsia="Century Schoolbook" w:hAnsi="Century Schoolbook" w:cs="Century Schoolbook"/>
+          <w:noProof/>
+        </w:rPr>
+        <w:drawing>
+          <wp:anchor distT="0" distB="0" distL="114300" distR="114300" simplePos="0" relativeHeight="251658240" behindDoc="0" locked="0" layoutInCell="1" allowOverlap="1" wp14:anchorId="01E9AB5B" wp14:editId="432CD67B">
+            <wp:simplePos x="0" y="0"/>
+            <wp:positionH relativeFrom="margin">
+              <wp:align>center</wp:align>
+            </wp:positionH>
+            <wp:positionV relativeFrom="paragraph">
+              <wp:posOffset>13970</wp:posOffset>
+            </wp:positionV>
+            <wp:extent cx="4429125" cy="1238250"/>
+            <wp:effectExtent l="0" t="0" r="9525" b="0"/>
+            <wp:wrapNone/>
+            <wp:docPr id="2" name="Imagen 2"/>
+            <wp:cNvGraphicFramePr>
+              <a:graphicFrameLocks xmlns:a="http://schemas.openxmlformats.org/drawingml/2006/main" noChangeAspect="1"/>
+            </wp:cNvGraphicFramePr>
+            <a:graphic xmlns:a="http://schemas.openxmlformats.org/drawingml/2006/main">
+              <a:graphicData uri="http://schemas.openxmlformats.org/drawingml/2006/picture">
+                <pic:pic xmlns:pic="http://schemas.openxmlformats.org/drawingml/2006/picture">
+                  <pic:nvPicPr>
+                    <pic:cNvPr id="0" name="Picture 1"/>
+                    <pic:cNvPicPr>
+                      <a:picLocks noChangeAspect="1" noChangeArrowheads="1"/>
+                    </pic:cNvPicPr>
+                  </pic:nvPicPr>
+                  <pic:blipFill>
+                    <a:blip r:embed="rId11">
+                      <a:extLst>
+                        <a:ext uri="{28A0092B-C50C-407E-A947-70E740481C1C}">
+                          <a14:useLocalDpi xmlns:a14="http://schemas.microsoft.com/office/drawing/2010/main" val="0"/>
+                        </a:ext>
+                      </a:extLst>
+                    </a:blip>
+                    <a:srcRect/>
+                    <a:stretch>
+                      <a:fillRect/>
+                    </a:stretch>
+                  </pic:blipFill>
+                  <pic:spPr bwMode="auto">
+                    <a:xfrm>
+                      <a:off x="0" y="0"/>
+                      <a:ext cx="4429125" cy="1238250"/>
+                    </a:xfrm>
+                    <a:prstGeom prst="rect">
+                      <a:avLst/>
+                    </a:prstGeom>
+                    <a:noFill/>
+                    <a:ln>
+                      <a:noFill/>
+                    </a:ln>
+                  </pic:spPr>
+                </pic:pic>
+              </a:graphicData>
+            </a:graphic>
+          </wp:anchor>
+        </w:drawing>
+      </w:r>
+    </w:p>
+    <w:p>
+      <w:pPr>
+        <w:spacing w:after="0" w:line="240" w:lineRule="auto"/>
+        <w:ind w:left="502" w:firstLine="0"/>
+        <w:jc w:val="both"/>
+        <w:rPr>
+          <w:rFonts w:ascii="Century Schoolbook" w:eastAsia="Century Schoolbook" w:hAnsi="Century Schoolbook" w:cs="Century Schoolbook"/>
+          <w:lang w:val="es-US"/>
+        </w:rPr>
+      </w:pPr>
+    </w:p>
+    <w:p>
+      <w:pPr>
+        <w:spacing w:after="0" w:line="240" w:lineRule="auto"/>
+        <w:ind w:left="502" w:firstLine="0"/>
+        <w:jc w:val="both"/>
+        <w:rPr>
+          <w:rFonts w:ascii="Century Schoolbook" w:eastAsia="Century Schoolbook" w:hAnsi="Century Schoolbook" w:cs="Century Schoolbook"/>
+          <w:lang w:val="es-US"/>
+        </w:rPr>
+      </w:pPr>
+    </w:p>
+    <w:p>
+      <w:pPr>
+        <w:spacing w:after="0" w:line="240" w:lineRule="auto"/>
+        <w:ind w:left="502" w:firstLine="0"/>
+        <w:jc w:val="both"/>
+        <w:rPr>
+          <w:rFonts w:ascii="Century Schoolbook" w:eastAsia="Century Schoolbook" w:hAnsi="Century Schoolbook" w:cs="Century Schoolbook"/>
+          <w:lang w:val="es-US"/>
+        </w:rPr>
+      </w:pPr>
+    </w:p>
+    <w:p>
+      <w:pPr>
+        <w:spacing w:after="0" w:line="240" w:lineRule="auto"/>
+        <w:ind w:left="502" w:firstLine="0"/>
+        <w:jc w:val="both"/>
+        <w:rPr>
+          <w:rFonts w:ascii="Century Schoolbook" w:eastAsia="Century Schoolbook" w:hAnsi="Century Schoolbook" w:cs="Century Schoolbook"/>
+          <w:lang w:val="es-US"/>
+        </w:rPr>
+      </w:pPr>
+    </w:p>
+    <w:p>
+      <w:pPr>
+        <w:spacing w:after="0" w:line="240" w:lineRule="auto"/>
+        <w:ind w:left="502" w:firstLine="0"/>
+        <w:jc w:val="both"/>
+        <w:rPr>
+          <w:rFonts w:ascii="Century Schoolbook" w:eastAsia="Century Schoolbook" w:hAnsi="Century Schoolbook" w:cs="Century Schoolbook"/>
+          <w:lang w:val="es-US"/>
+        </w:rPr>
+      </w:pPr>
+    </w:p>
+    <w:p>
+      <w:pPr>
+        <w:spacing w:after="0" w:line="240" w:lineRule="auto"/>
+        <w:ind w:left="502" w:firstLine="0"/>
+        <w:jc w:val="both"/>
+        <w:rPr>
+          <w:rFonts w:ascii="Century Schoolbook" w:eastAsia="Century Schoolbook" w:hAnsi="Century Schoolbook" w:cs="Century Schoolbook"/>
+          <w:lang w:val="es-AR"/>
+        </w:rPr>
+      </w:pPr>
+    </w:p>
+    <w:p>
+      <w:pPr>
         <w:ind w:left="720"/>
         <w:jc w:val="both"/>
         <w:rPr>
@@ -2715,9 +2994,39 @@
     </w:p>
     <w:p>
       <w:pPr>
+        <w:ind w:left="720"/>
+        <w:jc w:val="both"/>
+        <w:rPr>
+          <w:rFonts w:ascii="Century Schoolbook" w:eastAsia="Century Schoolbook" w:hAnsi="Century Schoolbook" w:cs="Century Schoolbook"/>
+          <w:lang w:val="es-US"/>
+        </w:rPr>
+      </w:pPr>
+    </w:p>
+    <w:p>
+      <w:pPr>
+        <w:ind w:left="720"/>
+        <w:jc w:val="both"/>
+        <w:rPr>
+          <w:rFonts w:ascii="Century Schoolbook" w:eastAsia="Century Schoolbook" w:hAnsi="Century Schoolbook" w:cs="Century Schoolbook"/>
+          <w:lang w:val="es-US"/>
+        </w:rPr>
+      </w:pPr>
+    </w:p>
+    <w:p>
+      <w:pPr>
+        <w:ind w:left="720"/>
+        <w:jc w:val="both"/>
+        <w:rPr>
+          <w:rFonts w:ascii="Century Schoolbook" w:eastAsia="Century Schoolbook" w:hAnsi="Century Schoolbook" w:cs="Century Schoolbook"/>
+          <w:lang w:val="es-US"/>
+        </w:rPr>
+      </w:pPr>
+    </w:p>
+    <w:p>
+      <w:pPr>
         <w:numPr>
           <w:ilvl w:val="0"/>
-          <w:numId w:val="2"/>
+          <w:numId w:val="7"/>
         </w:numPr>
         <w:spacing w:after="0" w:line="240" w:lineRule="auto"/>
         <w:jc w:val="both"/>
@@ -2730,6 +3039,7 @@
           <w:rFonts w:ascii="Century Schoolbook" w:eastAsia="Century Schoolbook" w:hAnsi="Century Schoolbook" w:cs="Century Schoolbook"/>
           <w:lang w:val="es-US"/>
         </w:rPr>
+        <w:lastRenderedPageBreak/>
         <w:t xml:space="preserve"> Muestren estadísticas descriptivas relevantes de </w:t>
       </w:r>
       <w:r>
@@ -2764,16 +3074,116 @@
         <w:rPr>
           <w:rFonts w:ascii="Century Schoolbook" w:eastAsia="Century Schoolbook" w:hAnsi="Century Schoolbook" w:cs="Century Schoolbook"/>
         </w:rPr>
-        <w:t xml:space="preserve">Comenten. </w:t>
-      </w:r>
-      <w:proofErr w:type="spellStart"/>
-      <w:r>
-        <w:rPr>
-          <w:rFonts w:ascii="Century Schoolbook" w:eastAsia="Century Schoolbook" w:hAnsi="Century Schoolbook" w:cs="Century Schoolbook"/>
-        </w:rPr>
-        <w:t>tulo</w:t>
-      </w:r>
-      <w:proofErr w:type="spellEnd"/>
+        <w:t>Comenten.</w:t>
+      </w:r>
+    </w:p>
+    <w:p>
+      <w:pPr>
+        <w:spacing w:after="0" w:line="240" w:lineRule="auto"/>
+        <w:ind w:left="502" w:firstLine="0"/>
+        <w:jc w:val="both"/>
+        <w:rPr>
+          <w:rFonts w:ascii="Century Schoolbook" w:eastAsia="Century Schoolbook" w:hAnsi="Century Schoolbook" w:cs="Century Schoolbook"/>
+        </w:rPr>
+      </w:pPr>
+    </w:p>
+    <w:p>
+      <w:pPr>
+        <w:spacing w:after="0" w:line="240" w:lineRule="auto"/>
+        <w:ind w:left="502" w:firstLine="0"/>
+        <w:jc w:val="both"/>
+        <w:rPr>
+          <w:rFonts w:ascii="Century Schoolbook" w:eastAsia="Century Schoolbook" w:hAnsi="Century Schoolbook" w:cs="Century Schoolbook"/>
+        </w:rPr>
+      </w:pPr>
+    </w:p>
+    <w:p>
+      <w:pPr>
+        <w:spacing w:after="0" w:line="240" w:lineRule="auto"/>
+        <w:ind w:left="502" w:firstLine="0"/>
+        <w:jc w:val="both"/>
+        <w:rPr>
+          <w:rFonts w:ascii="Century Schoolbook" w:eastAsia="Century Schoolbook" w:hAnsi="Century Schoolbook" w:cs="Century Schoolbook"/>
+        </w:rPr>
+      </w:pPr>
+      <w:r>
+        <w:rPr>
+          <w:rFonts w:ascii="Century Schoolbook" w:eastAsia="Century Schoolbook" w:hAnsi="Century Schoolbook" w:cs="Century Schoolbook"/>
+          <w:noProof/>
+        </w:rPr>
+        <w:drawing>
+          <wp:anchor distT="0" distB="0" distL="114300" distR="114300" simplePos="0" relativeHeight="251661312" behindDoc="0" locked="0" layoutInCell="1" allowOverlap="1" wp14:anchorId="64AEC16B" wp14:editId="52C1CBE6">
+            <wp:simplePos x="0" y="0"/>
+            <wp:positionH relativeFrom="margin">
+              <wp:align>center</wp:align>
+            </wp:positionH>
+            <wp:positionV relativeFrom="paragraph">
+              <wp:posOffset>16510</wp:posOffset>
+            </wp:positionV>
+            <wp:extent cx="4154655" cy="1238250"/>
+            <wp:effectExtent l="0" t="0" r="0" b="0"/>
+            <wp:wrapNone/>
+            <wp:docPr id="5" name="Imagen 5"/>
+            <wp:cNvGraphicFramePr>
+              <a:graphicFrameLocks xmlns:a="http://schemas.openxmlformats.org/drawingml/2006/main" noChangeAspect="1"/>
+            </wp:cNvGraphicFramePr>
+            <a:graphic xmlns:a="http://schemas.openxmlformats.org/drawingml/2006/main">
+              <a:graphicData uri="http://schemas.openxmlformats.org/drawingml/2006/picture">
+                <pic:pic xmlns:pic="http://schemas.openxmlformats.org/drawingml/2006/picture">
+                  <pic:nvPicPr>
+                    <pic:cNvPr id="0" name="Picture 7"/>
+                    <pic:cNvPicPr>
+                      <a:picLocks noChangeAspect="1" noChangeArrowheads="1"/>
+                    </pic:cNvPicPr>
+                  </pic:nvPicPr>
+                  <pic:blipFill>
+                    <a:blip r:embed="rId12" cstate="print">
+                      <a:extLst>
+                        <a:ext uri="{28A0092B-C50C-407E-A947-70E740481C1C}">
+                          <a14:useLocalDpi xmlns:a14="http://schemas.microsoft.com/office/drawing/2010/main" val="0"/>
+                        </a:ext>
+                      </a:extLst>
+                    </a:blip>
+                    <a:srcRect/>
+                    <a:stretch>
+                      <a:fillRect/>
+                    </a:stretch>
+                  </pic:blipFill>
+                  <pic:spPr bwMode="auto">
+                    <a:xfrm>
+                      <a:off x="0" y="0"/>
+                      <a:ext cx="4154655" cy="1238250"/>
+                    </a:xfrm>
+                    <a:prstGeom prst="rect">
+                      <a:avLst/>
+                    </a:prstGeom>
+                    <a:noFill/>
+                    <a:ln>
+                      <a:noFill/>
+                    </a:ln>
+                  </pic:spPr>
+                </pic:pic>
+              </a:graphicData>
+            </a:graphic>
+            <wp14:sizeRelH relativeFrom="margin">
+              <wp14:pctWidth>0</wp14:pctWidth>
+            </wp14:sizeRelH>
+            <wp14:sizeRelV relativeFrom="margin">
+              <wp14:pctHeight>0</wp14:pctHeight>
+            </wp14:sizeRelV>
+          </wp:anchor>
+        </w:drawing>
+      </w:r>
+    </w:p>
+    <w:p>
+      <w:pPr>
+        <w:spacing w:after="0" w:line="240" w:lineRule="auto"/>
+        <w:ind w:left="502" w:firstLine="0"/>
+        <w:jc w:val="both"/>
+        <w:rPr>
+          <w:rFonts w:ascii="Century Schoolbook" w:eastAsia="Century Schoolbook" w:hAnsi="Century Schoolbook" w:cs="Century Schoolbook"/>
+        </w:rPr>
+      </w:pPr>
     </w:p>
     <w:p>
       <w:pPr>
@@ -2781,9 +3191,320 @@
         <w:ind w:left="0" w:firstLine="0"/>
       </w:pPr>
     </w:p>
+    <w:p>
+      <w:pPr>
+        <w:spacing w:after="94" w:line="356" w:lineRule="auto"/>
+        <w:ind w:left="0" w:firstLine="0"/>
+      </w:pPr>
+    </w:p>
+    <w:p>
+      <w:pPr>
+        <w:pStyle w:val="NormalWeb"/>
+      </w:pPr>
+    </w:p>
+    <w:p>
+      <w:pPr>
+        <w:spacing w:before="240" w:after="0" w:line="240" w:lineRule="auto"/>
+        <w:ind w:left="502" w:firstLine="0"/>
+        <w:jc w:val="both"/>
+        <w:rPr>
+          <w:rFonts w:ascii="Century Schoolbook" w:eastAsia="Century Schoolbook" w:hAnsi="Century Schoolbook" w:cs="Century Schoolbook"/>
+          <w:lang w:val="es-US"/>
+        </w:rPr>
+      </w:pPr>
+      <w:r>
+        <w:rPr>
+          <w:rFonts w:ascii="Century Schoolbook" w:eastAsia="Century Schoolbook" w:hAnsi="Century Schoolbook" w:cs="Century Schoolbook"/>
+          <w:lang w:val="es-US"/>
+        </w:rPr>
+        <w:t>En 2005, se identificaron 228 pobres y 2100 no pobres, sobre un total de 2328 personas; la tasa de pobreza fue de 9,79%.</w:t>
+      </w:r>
+    </w:p>
+    <w:p>
+      <w:pPr>
+        <w:spacing w:before="240" w:after="0" w:line="240" w:lineRule="auto"/>
+        <w:ind w:left="502" w:firstLine="0"/>
+        <w:jc w:val="both"/>
+        <w:rPr>
+          <w:rFonts w:ascii="Century Schoolbook" w:eastAsia="Century Schoolbook" w:hAnsi="Century Schoolbook" w:cs="Century Schoolbook"/>
+          <w:lang w:val="es-US"/>
+        </w:rPr>
+      </w:pPr>
+      <w:r>
+        <w:rPr>
+          <w:rFonts w:ascii="Century Schoolbook" w:eastAsia="Century Schoolbook" w:hAnsi="Century Schoolbook" w:cs="Century Schoolbook"/>
+          <w:lang w:val="es-US"/>
+        </w:rPr>
+        <w:drawing>
+          <wp:anchor distT="0" distB="0" distL="114300" distR="114300" simplePos="0" relativeHeight="251659264" behindDoc="0" locked="0" layoutInCell="1" allowOverlap="1" wp14:anchorId="43D81175" wp14:editId="1096148E">
+            <wp:simplePos x="0" y="0"/>
+            <wp:positionH relativeFrom="page">
+              <wp:align>left</wp:align>
+            </wp:positionH>
+            <wp:positionV relativeFrom="paragraph">
+              <wp:posOffset>571500</wp:posOffset>
+            </wp:positionV>
+            <wp:extent cx="3667144" cy="2733675"/>
+            <wp:effectExtent l="0" t="0" r="9525" b="0"/>
+            <wp:wrapNone/>
+            <wp:docPr id="3" name="Imagen 3"/>
+            <wp:cNvGraphicFramePr>
+              <a:graphicFrameLocks xmlns:a="http://schemas.openxmlformats.org/drawingml/2006/main" noChangeAspect="1"/>
+            </wp:cNvGraphicFramePr>
+            <a:graphic xmlns:a="http://schemas.openxmlformats.org/drawingml/2006/main">
+              <a:graphicData uri="http://schemas.openxmlformats.org/drawingml/2006/picture">
+                <pic:pic xmlns:pic="http://schemas.openxmlformats.org/drawingml/2006/picture">
+                  <pic:nvPicPr>
+                    <pic:cNvPr id="0" name="Picture 3"/>
+                    <pic:cNvPicPr>
+                      <a:picLocks noChangeAspect="1" noChangeArrowheads="1"/>
+                    </pic:cNvPicPr>
+                  </pic:nvPicPr>
+                  <pic:blipFill>
+                    <a:blip r:embed="rId13">
+                      <a:extLst>
+                        <a:ext uri="{28A0092B-C50C-407E-A947-70E740481C1C}">
+                          <a14:useLocalDpi xmlns:a14="http://schemas.microsoft.com/office/drawing/2010/main" val="0"/>
+                        </a:ext>
+                      </a:extLst>
+                    </a:blip>
+                    <a:srcRect/>
+                    <a:stretch>
+                      <a:fillRect/>
+                    </a:stretch>
+                  </pic:blipFill>
+                  <pic:spPr bwMode="auto">
+                    <a:xfrm>
+                      <a:off x="0" y="0"/>
+                      <a:ext cx="3667144" cy="2733675"/>
+                    </a:xfrm>
+                    <a:prstGeom prst="rect">
+                      <a:avLst/>
+                    </a:prstGeom>
+                    <a:noFill/>
+                    <a:ln>
+                      <a:noFill/>
+                    </a:ln>
+                  </pic:spPr>
+                </pic:pic>
+              </a:graphicData>
+            </a:graphic>
+            <wp14:sizeRelH relativeFrom="margin">
+              <wp14:pctWidth>0</wp14:pctWidth>
+            </wp14:sizeRelH>
+            <wp14:sizeRelV relativeFrom="margin">
+              <wp14:pctHeight>0</wp14:pctHeight>
+            </wp14:sizeRelV>
+          </wp:anchor>
+        </w:drawing>
+      </w:r>
+      <w:r>
+        <w:rPr>
+          <w:rFonts w:ascii="Century Schoolbook" w:eastAsia="Century Schoolbook" w:hAnsi="Century Schoolbook" w:cs="Century Schoolbook"/>
+          <w:lang w:val="es-US"/>
+        </w:rPr>
+        <w:drawing>
+          <wp:anchor distT="0" distB="0" distL="114300" distR="114300" simplePos="0" relativeHeight="251660288" behindDoc="0" locked="0" layoutInCell="1" allowOverlap="1" wp14:anchorId="60A6E113" wp14:editId="0C98E539">
+            <wp:simplePos x="0" y="0"/>
+            <wp:positionH relativeFrom="page">
+              <wp:align>right</wp:align>
+            </wp:positionH>
+            <wp:positionV relativeFrom="paragraph">
+              <wp:posOffset>534035</wp:posOffset>
+            </wp:positionV>
+            <wp:extent cx="3654371" cy="2724150"/>
+            <wp:effectExtent l="0" t="0" r="3810" b="0"/>
+            <wp:wrapNone/>
+            <wp:docPr id="4" name="Imagen 4"/>
+            <wp:cNvGraphicFramePr>
+              <a:graphicFrameLocks xmlns:a="http://schemas.openxmlformats.org/drawingml/2006/main" noChangeAspect="1"/>
+            </wp:cNvGraphicFramePr>
+            <a:graphic xmlns:a="http://schemas.openxmlformats.org/drawingml/2006/main">
+              <a:graphicData uri="http://schemas.openxmlformats.org/drawingml/2006/picture">
+                <pic:pic xmlns:pic="http://schemas.openxmlformats.org/drawingml/2006/picture">
+                  <pic:nvPicPr>
+                    <pic:cNvPr id="0" name="Picture 5"/>
+                    <pic:cNvPicPr>
+                      <a:picLocks noChangeAspect="1" noChangeArrowheads="1"/>
+                    </pic:cNvPicPr>
+                  </pic:nvPicPr>
+                  <pic:blipFill>
+                    <a:blip r:embed="rId14">
+                      <a:extLst>
+                        <a:ext uri="{28A0092B-C50C-407E-A947-70E740481C1C}">
+                          <a14:useLocalDpi xmlns:a14="http://schemas.microsoft.com/office/drawing/2010/main" val="0"/>
+                        </a:ext>
+                      </a:extLst>
+                    </a:blip>
+                    <a:srcRect/>
+                    <a:stretch>
+                      <a:fillRect/>
+                    </a:stretch>
+                  </pic:blipFill>
+                  <pic:spPr bwMode="auto">
+                    <a:xfrm>
+                      <a:off x="0" y="0"/>
+                      <a:ext cx="3654371" cy="2724150"/>
+                    </a:xfrm>
+                    <a:prstGeom prst="rect">
+                      <a:avLst/>
+                    </a:prstGeom>
+                    <a:noFill/>
+                    <a:ln>
+                      <a:noFill/>
+                    </a:ln>
+                  </pic:spPr>
+                </pic:pic>
+              </a:graphicData>
+            </a:graphic>
+            <wp14:sizeRelH relativeFrom="margin">
+              <wp14:pctWidth>0</wp14:pctWidth>
+            </wp14:sizeRelH>
+            <wp14:sizeRelV relativeFrom="margin">
+              <wp14:pctHeight>0</wp14:pctHeight>
+            </wp14:sizeRelV>
+          </wp:anchor>
+        </w:drawing>
+      </w:r>
+      <w:r>
+        <w:rPr>
+          <w:rFonts w:ascii="Century Schoolbook" w:eastAsia="Century Schoolbook" w:hAnsi="Century Schoolbook" w:cs="Century Schoolbook"/>
+          <w:lang w:val="es-US"/>
+        </w:rPr>
+        <w:t xml:space="preserve">En 2025, se identificaron 127 pobres y 802 no pobres, sobre un total de 929 personas; la tasa de pobreza fue de 13,67%. </w:t>
+      </w:r>
+    </w:p>
+    <w:p>
+      <w:pPr>
+        <w:spacing w:before="240" w:after="0" w:line="240" w:lineRule="auto"/>
+        <w:ind w:left="502" w:firstLine="0"/>
+        <w:jc w:val="both"/>
+        <w:rPr>
+          <w:rFonts w:ascii="Century Schoolbook" w:eastAsia="Century Schoolbook" w:hAnsi="Century Schoolbook" w:cs="Century Schoolbook"/>
+          <w:lang w:val="es-US"/>
+        </w:rPr>
+      </w:pPr>
+    </w:p>
+    <w:p>
+      <w:pPr>
+        <w:spacing w:before="240" w:after="0" w:line="240" w:lineRule="auto"/>
+        <w:ind w:left="502" w:firstLine="0"/>
+        <w:jc w:val="both"/>
+        <w:rPr>
+          <w:rFonts w:ascii="Century Schoolbook" w:eastAsia="Century Schoolbook" w:hAnsi="Century Schoolbook" w:cs="Century Schoolbook"/>
+          <w:lang w:val="es-US"/>
+        </w:rPr>
+      </w:pPr>
+    </w:p>
+    <w:p>
+      <w:pPr>
+        <w:spacing w:before="240" w:after="0" w:line="240" w:lineRule="auto"/>
+        <w:ind w:left="502" w:firstLine="0"/>
+        <w:jc w:val="both"/>
+        <w:rPr>
+          <w:rFonts w:ascii="Century Schoolbook" w:eastAsia="Century Schoolbook" w:hAnsi="Century Schoolbook" w:cs="Century Schoolbook"/>
+          <w:lang w:val="es-US"/>
+        </w:rPr>
+      </w:pPr>
+    </w:p>
+    <w:p>
+      <w:pPr>
+        <w:spacing w:before="240" w:after="0" w:line="240" w:lineRule="auto"/>
+        <w:ind w:left="502" w:firstLine="0"/>
+        <w:jc w:val="both"/>
+        <w:rPr>
+          <w:rFonts w:ascii="Century Schoolbook" w:eastAsia="Century Schoolbook" w:hAnsi="Century Schoolbook" w:cs="Century Schoolbook"/>
+          <w:lang w:val="es-US"/>
+        </w:rPr>
+      </w:pPr>
+    </w:p>
+    <w:p>
+      <w:pPr>
+        <w:spacing w:before="240" w:after="0" w:line="240" w:lineRule="auto"/>
+        <w:ind w:left="502" w:firstLine="0"/>
+        <w:jc w:val="both"/>
+        <w:rPr>
+          <w:rFonts w:ascii="Century Schoolbook" w:eastAsia="Century Schoolbook" w:hAnsi="Century Schoolbook" w:cs="Century Schoolbook"/>
+          <w:lang w:val="es-US"/>
+        </w:rPr>
+      </w:pPr>
+    </w:p>
+    <w:p>
+      <w:pPr>
+        <w:spacing w:before="240" w:after="0" w:line="240" w:lineRule="auto"/>
+        <w:ind w:left="502" w:firstLine="0"/>
+        <w:jc w:val="both"/>
+        <w:rPr>
+          <w:rFonts w:ascii="Century Schoolbook" w:eastAsia="Century Schoolbook" w:hAnsi="Century Schoolbook" w:cs="Century Schoolbook"/>
+          <w:lang w:val="es-US"/>
+        </w:rPr>
+      </w:pPr>
+    </w:p>
+    <w:p>
+      <w:pPr>
+        <w:spacing w:before="240" w:after="0" w:line="240" w:lineRule="auto"/>
+        <w:ind w:left="502" w:firstLine="0"/>
+        <w:jc w:val="both"/>
+        <w:rPr>
+          <w:rFonts w:ascii="Century Schoolbook" w:eastAsia="Century Schoolbook" w:hAnsi="Century Schoolbook" w:cs="Century Schoolbook"/>
+          <w:lang w:val="es-US"/>
+        </w:rPr>
+      </w:pPr>
+    </w:p>
+    <w:p>
+      <w:pPr>
+        <w:spacing w:before="240" w:after="0" w:line="240" w:lineRule="auto"/>
+        <w:ind w:left="502" w:firstLine="0"/>
+        <w:jc w:val="both"/>
+        <w:rPr>
+          <w:rFonts w:ascii="Century Schoolbook" w:eastAsia="Century Schoolbook" w:hAnsi="Century Schoolbook" w:cs="Century Schoolbook"/>
+          <w:lang w:val="es-US"/>
+        </w:rPr>
+      </w:pPr>
+    </w:p>
+    <w:p>
+      <w:pPr>
+        <w:spacing w:before="240" w:after="0" w:line="240" w:lineRule="auto"/>
+        <w:ind w:left="502" w:firstLine="0"/>
+        <w:jc w:val="both"/>
+        <w:rPr>
+          <w:rFonts w:ascii="Century Schoolbook" w:eastAsia="Century Schoolbook" w:hAnsi="Century Schoolbook" w:cs="Century Schoolbook"/>
+          <w:lang w:val="es-US"/>
+        </w:rPr>
+      </w:pPr>
+    </w:p>
+    <w:p>
+      <w:pPr>
+        <w:spacing w:before="240" w:after="0" w:line="240" w:lineRule="auto"/>
+        <w:ind w:left="502" w:firstLine="0"/>
+        <w:jc w:val="both"/>
+        <w:rPr>
+          <w:rFonts w:ascii="Century Schoolbook" w:eastAsia="Century Schoolbook" w:hAnsi="Century Schoolbook" w:cs="Century Schoolbook"/>
+          <w:lang w:val="es-US"/>
+        </w:rPr>
+      </w:pPr>
+      <w:r>
+        <w:rPr>
+          <w:rFonts w:ascii="Century Schoolbook" w:eastAsia="Century Schoolbook" w:hAnsi="Century Schoolbook" w:cs="Century Schoolbook"/>
+          <w:lang w:val="es-US"/>
+        </w:rPr>
+        <w:t>Los resultados muestran que, si bien la cantidad absoluta de pobres disminuye entre 2005 y 2025, su peso relativo en la muestra aumenta. En 2005 la pobreza alcanzaba al 9,8% de la población, mientras que en 2025 asciende al 13,7%. Esto indica un deterioro en términos relativos: la proporción de personas en situación de pobreza creció, aun cuando el número total de observaciones se redujo.</w:t>
+      </w:r>
+    </w:p>
+    <w:p>
+      <w:pPr>
+        <w:spacing w:before="240" w:after="0" w:line="240" w:lineRule="auto"/>
+        <w:ind w:left="502" w:firstLine="0"/>
+        <w:jc w:val="both"/>
+        <w:rPr>
+          <w:rFonts w:ascii="Century Schoolbook" w:eastAsia="Century Schoolbook" w:hAnsi="Century Schoolbook" w:cs="Century Schoolbook"/>
+          <w:lang w:val="es-US"/>
+        </w:rPr>
+      </w:pPr>
+    </w:p>
     <w:sectPr>
-      <w:headerReference w:type="default" r:id="rId11"/>
-      <w:footerReference w:type="default" r:id="rId12"/>
+      <w:headerReference w:type="default" r:id="rId15"/>
+      <w:footerReference w:type="default" r:id="rId16"/>
       <w:pgSz w:w="11900" w:h="16840"/>
       <w:pgMar w:top="1412" w:right="1627" w:bottom="1319" w:left="1701" w:header="720" w:footer="720" w:gutter="0"/>
       <w:cols w:space="720"/>
@@ -2793,7 +3514,7 @@
 </file>
 
 <file path=word/endnotes.xml><?xml version="1.0" encoding="utf-8"?>
-<w:endnotes xmlns:wpc="http://schemas.microsoft.com/office/word/2010/wordprocessingCanvas" xmlns:cx="http://schemas.microsoft.com/office/drawing/2014/chartex" xmlns:cx1="http://schemas.microsoft.com/office/drawing/2015/9/8/chartex" xmlns:cx2="http://schemas.microsoft.com/office/drawing/2015/10/21/chartex" xmlns:cx3="http://schemas.microsoft.com/office/drawing/2016/5/9/chartex" xmlns:cx4="http://schemas.microsoft.com/office/drawing/2016/5/10/chartex" xmlns:cx5="http://schemas.microsoft.com/office/drawing/2016/5/11/chartex" xmlns:cx6="http://schemas.microsoft.com/office/drawing/2016/5/12/chartex" xmlns:cx7="http://schemas.microsoft.com/office/drawing/2016/5/13/chartex" xmlns:cx8="http://schemas.microsoft.com/office/drawing/2016/5/14/chartex" xmlns:mc="http://schemas.openxmlformats.org/markup-compatibility/2006" xmlns:aink="http://schemas.microsoft.com/office/drawing/2016/ink" xmlns:am3d="http://schemas.microsoft.com/office/drawing/2017/model3d" xmlns:o="urn:schemas-microsoft-com:office:office" xmlns:oel="http://schemas.microsoft.com/office/2019/extlst" xmlns:r="http://schemas.openxmlformats.org/officeDocument/2006/relationships" xmlns:m="http://schemas.openxmlformats.org/officeDocument/2006/math" xmlns:v="urn:schemas-microsoft-com:vml" xmlns:wp14="http://schemas.microsoft.com/office/word/2010/wordprocessingDrawing" xmlns:wp="http://schemas.openxmlformats.org/drawingml/2006/wordprocessingDrawing" xmlns:w10="urn:schemas-microsoft-com:office:word" xmlns:w="http://schemas.openxmlformats.org/wordprocessingml/2006/main" xmlns:w14="http://schemas.microsoft.com/office/word/2010/wordml" xmlns:w15="http://schemas.microsoft.com/office/word/2012/wordml" xmlns:w16cex="http://schemas.microsoft.com/office/word/2018/wordml/cex" xmlns:w16cid="http://schemas.microsoft.com/office/word/2016/wordml/cid" xmlns:w16="http://schemas.microsoft.com/office/word/2018/wordml" xmlns:w16sdtdh="http://schemas.microsoft.com/office/word/2020/wordml/sdtdatahash" xmlns:w16se="http://schemas.microsoft.com/office/word/2015/wordml/symex" xmlns:wpg="http://schemas.microsoft.com/office/word/2010/wordprocessingGroup" xmlns:wpi="http://schemas.microsoft.com/office/word/2010/wordprocessingInk" xmlns:wne="http://schemas.microsoft.com/office/word/2006/wordml" xmlns:wps="http://schemas.microsoft.com/office/word/2010/wordprocessingShape" mc:Ignorable="w14 w15 w16se w16cid w16 w16cex w16sdtdh wp14">
+<w:endnotes xmlns:wpc="http://schemas.microsoft.com/office/word/2010/wordprocessingCanvas" xmlns:cx="http://schemas.microsoft.com/office/drawing/2014/chartex" xmlns:cx1="http://schemas.microsoft.com/office/drawing/2015/9/8/chartex" xmlns:cx2="http://schemas.microsoft.com/office/drawing/2015/10/21/chartex" xmlns:cx3="http://schemas.microsoft.com/office/drawing/2016/5/9/chartex" xmlns:cx4="http://schemas.microsoft.com/office/drawing/2016/5/10/chartex" xmlns:cx5="http://schemas.microsoft.com/office/drawing/2016/5/11/chartex" xmlns:cx6="http://schemas.microsoft.com/office/drawing/2016/5/12/chartex" xmlns:cx7="http://schemas.microsoft.com/office/drawing/2016/5/13/chartex" xmlns:cx8="http://schemas.microsoft.com/office/drawing/2016/5/14/chartex" xmlns:mc="http://schemas.openxmlformats.org/markup-compatibility/2006" xmlns:aink="http://schemas.microsoft.com/office/drawing/2016/ink" xmlns:am3d="http://schemas.microsoft.com/office/drawing/2017/model3d" xmlns:o="urn:schemas-microsoft-com:office:office" xmlns:r="http://schemas.openxmlformats.org/officeDocument/2006/relationships" xmlns:m="http://schemas.openxmlformats.org/officeDocument/2006/math" xmlns:v="urn:schemas-microsoft-com:vml" xmlns:wp14="http://schemas.microsoft.com/office/word/2010/wordprocessingDrawing" xmlns:wp="http://schemas.openxmlformats.org/drawingml/2006/wordprocessingDrawing" xmlns:w10="urn:schemas-microsoft-com:office:word" xmlns:w="http://schemas.openxmlformats.org/wordprocessingml/2006/main" xmlns:w14="http://schemas.microsoft.com/office/word/2010/wordml" xmlns:w15="http://schemas.microsoft.com/office/word/2012/wordml" xmlns:w16cex="http://schemas.microsoft.com/office/word/2018/wordml/cex" xmlns:w16cid="http://schemas.microsoft.com/office/word/2016/wordml/cid" xmlns:w16="http://schemas.microsoft.com/office/word/2018/wordml" xmlns:w16sdtdh="http://schemas.microsoft.com/office/word/2020/wordml/sdtdatahash" xmlns:w16se="http://schemas.microsoft.com/office/word/2015/wordml/symex" xmlns:wpg="http://schemas.microsoft.com/office/word/2010/wordprocessingGroup" xmlns:wpi="http://schemas.microsoft.com/office/word/2010/wordprocessingInk" xmlns:wne="http://schemas.microsoft.com/office/word/2006/wordml" xmlns:wps="http://schemas.microsoft.com/office/word/2010/wordprocessingShape" mc:Ignorable="w14 w15 w16se w16cid w16 w16cex w16sdtdh wp14">
   <w:endnote w:type="separator" w:id="-1">
     <w:p>
       <w:pPr>
@@ -2818,7 +3539,7 @@
 </file>
 
 <file path=word/footer1.xml><?xml version="1.0" encoding="utf-8"?>
-<w:ftr xmlns:wpc="http://schemas.microsoft.com/office/word/2010/wordprocessingCanvas" xmlns:cx="http://schemas.microsoft.com/office/drawing/2014/chartex" xmlns:cx1="http://schemas.microsoft.com/office/drawing/2015/9/8/chartex" xmlns:cx2="http://schemas.microsoft.com/office/drawing/2015/10/21/chartex" xmlns:cx3="http://schemas.microsoft.com/office/drawing/2016/5/9/chartex" xmlns:cx4="http://schemas.microsoft.com/office/drawing/2016/5/10/chartex" xmlns:cx5="http://schemas.microsoft.com/office/drawing/2016/5/11/chartex" xmlns:cx6="http://schemas.microsoft.com/office/drawing/2016/5/12/chartex" xmlns:cx7="http://schemas.microsoft.com/office/drawing/2016/5/13/chartex" xmlns:cx8="http://schemas.microsoft.com/office/drawing/2016/5/14/chartex" xmlns:mc="http://schemas.openxmlformats.org/markup-compatibility/2006" xmlns:aink="http://schemas.microsoft.com/office/drawing/2016/ink" xmlns:am3d="http://schemas.microsoft.com/office/drawing/2017/model3d" xmlns:o="urn:schemas-microsoft-com:office:office" xmlns:oel="http://schemas.microsoft.com/office/2019/extlst" xmlns:r="http://schemas.openxmlformats.org/officeDocument/2006/relationships" xmlns:m="http://schemas.openxmlformats.org/officeDocument/2006/math" xmlns:v="urn:schemas-microsoft-com:vml" xmlns:wp14="http://schemas.microsoft.com/office/word/2010/wordprocessingDrawing" xmlns:wp="http://schemas.openxmlformats.org/drawingml/2006/wordprocessingDrawing" xmlns:w10="urn:schemas-microsoft-com:office:word" xmlns:w="http://schemas.openxmlformats.org/wordprocessingml/2006/main" xmlns:w14="http://schemas.microsoft.com/office/word/2010/wordml" xmlns:w15="http://schemas.microsoft.com/office/word/2012/wordml" xmlns:w16cex="http://schemas.microsoft.com/office/word/2018/wordml/cex" xmlns:w16cid="http://schemas.microsoft.com/office/word/2016/wordml/cid" xmlns:w16="http://schemas.microsoft.com/office/word/2018/wordml" xmlns:w16sdtdh="http://schemas.microsoft.com/office/word/2020/wordml/sdtdatahash" xmlns:w16se="http://schemas.microsoft.com/office/word/2015/wordml/symex" xmlns:wpg="http://schemas.microsoft.com/office/word/2010/wordprocessingGroup" xmlns:wpi="http://schemas.microsoft.com/office/word/2010/wordprocessingInk" xmlns:wne="http://schemas.microsoft.com/office/word/2006/wordml" xmlns:wps="http://schemas.microsoft.com/office/word/2010/wordprocessingShape" mc:Ignorable="w14 w15 w16se w16cid w16 w16cex w16sdtdh wp14">
+<w:ftr xmlns:wpc="http://schemas.microsoft.com/office/word/2010/wordprocessingCanvas" xmlns:cx="http://schemas.microsoft.com/office/drawing/2014/chartex" xmlns:cx1="http://schemas.microsoft.com/office/drawing/2015/9/8/chartex" xmlns:cx2="http://schemas.microsoft.com/office/drawing/2015/10/21/chartex" xmlns:cx3="http://schemas.microsoft.com/office/drawing/2016/5/9/chartex" xmlns:cx4="http://schemas.microsoft.com/office/drawing/2016/5/10/chartex" xmlns:cx5="http://schemas.microsoft.com/office/drawing/2016/5/11/chartex" xmlns:cx6="http://schemas.microsoft.com/office/drawing/2016/5/12/chartex" xmlns:cx7="http://schemas.microsoft.com/office/drawing/2016/5/13/chartex" xmlns:cx8="http://schemas.microsoft.com/office/drawing/2016/5/14/chartex" xmlns:mc="http://schemas.openxmlformats.org/markup-compatibility/2006" xmlns:aink="http://schemas.microsoft.com/office/drawing/2016/ink" xmlns:am3d="http://schemas.microsoft.com/office/drawing/2017/model3d" xmlns:o="urn:schemas-microsoft-com:office:office" xmlns:r="http://schemas.openxmlformats.org/officeDocument/2006/relationships" xmlns:m="http://schemas.openxmlformats.org/officeDocument/2006/math" xmlns:v="urn:schemas-microsoft-com:vml" xmlns:wp14="http://schemas.microsoft.com/office/word/2010/wordprocessingDrawing" xmlns:wp="http://schemas.openxmlformats.org/drawingml/2006/wordprocessingDrawing" xmlns:w10="urn:schemas-microsoft-com:office:word" xmlns:w="http://schemas.openxmlformats.org/wordprocessingml/2006/main" xmlns:w14="http://schemas.microsoft.com/office/word/2010/wordml" xmlns:w15="http://schemas.microsoft.com/office/word/2012/wordml" xmlns:w16cex="http://schemas.microsoft.com/office/word/2018/wordml/cex" xmlns:w16cid="http://schemas.microsoft.com/office/word/2016/wordml/cid" xmlns:w16="http://schemas.microsoft.com/office/word/2018/wordml" xmlns:w16sdtdh="http://schemas.microsoft.com/office/word/2020/wordml/sdtdatahash" xmlns:w16se="http://schemas.microsoft.com/office/word/2015/wordml/symex" xmlns:wpg="http://schemas.microsoft.com/office/word/2010/wordprocessingGroup" xmlns:wpi="http://schemas.microsoft.com/office/word/2010/wordprocessingInk" xmlns:wne="http://schemas.microsoft.com/office/word/2006/wordml" xmlns:wps="http://schemas.microsoft.com/office/word/2010/wordprocessingShape" mc:Ignorable="w14 w15 w16se w16cid w16 w16cex w16sdtdh wp14">
   <w:p>
     <w:pPr>
       <w:tabs>
@@ -2939,7 +3660,7 @@
 </file>
 
 <file path=word/footnotes.xml><?xml version="1.0" encoding="utf-8"?>
-<w:footnotes xmlns:wpc="http://schemas.microsoft.com/office/word/2010/wordprocessingCanvas" xmlns:cx="http://schemas.microsoft.com/office/drawing/2014/chartex" xmlns:cx1="http://schemas.microsoft.com/office/drawing/2015/9/8/chartex" xmlns:cx2="http://schemas.microsoft.com/office/drawing/2015/10/21/chartex" xmlns:cx3="http://schemas.microsoft.com/office/drawing/2016/5/9/chartex" xmlns:cx4="http://schemas.microsoft.com/office/drawing/2016/5/10/chartex" xmlns:cx5="http://schemas.microsoft.com/office/drawing/2016/5/11/chartex" xmlns:cx6="http://schemas.microsoft.com/office/drawing/2016/5/12/chartex" xmlns:cx7="http://schemas.microsoft.com/office/drawing/2016/5/13/chartex" xmlns:cx8="http://schemas.microsoft.com/office/drawing/2016/5/14/chartex" xmlns:mc="http://schemas.openxmlformats.org/markup-compatibility/2006" xmlns:aink="http://schemas.microsoft.com/office/drawing/2016/ink" xmlns:am3d="http://schemas.microsoft.com/office/drawing/2017/model3d" xmlns:o="urn:schemas-microsoft-com:office:office" xmlns:oel="http://schemas.microsoft.com/office/2019/extlst" xmlns:r="http://schemas.openxmlformats.org/officeDocument/2006/relationships" xmlns:m="http://schemas.openxmlformats.org/officeDocument/2006/math" xmlns:v="urn:schemas-microsoft-com:vml" xmlns:wp14="http://schemas.microsoft.com/office/word/2010/wordprocessingDrawing" xmlns:wp="http://schemas.openxmlformats.org/drawingml/2006/wordprocessingDrawing" xmlns:w10="urn:schemas-microsoft-com:office:word" xmlns:w="http://schemas.openxmlformats.org/wordprocessingml/2006/main" xmlns:w14="http://schemas.microsoft.com/office/word/2010/wordml" xmlns:w15="http://schemas.microsoft.com/office/word/2012/wordml" xmlns:w16cex="http://schemas.microsoft.com/office/word/2018/wordml/cex" xmlns:w16cid="http://schemas.microsoft.com/office/word/2016/wordml/cid" xmlns:w16="http://schemas.microsoft.com/office/word/2018/wordml" xmlns:w16sdtdh="http://schemas.microsoft.com/office/word/2020/wordml/sdtdatahash" xmlns:w16se="http://schemas.microsoft.com/office/word/2015/wordml/symex" xmlns:wpg="http://schemas.microsoft.com/office/word/2010/wordprocessingGroup" xmlns:wpi="http://schemas.microsoft.com/office/word/2010/wordprocessingInk" xmlns:wne="http://schemas.microsoft.com/office/word/2006/wordml" xmlns:wps="http://schemas.microsoft.com/office/word/2010/wordprocessingShape" mc:Ignorable="w14 w15 w16se w16cid w16 w16cex w16sdtdh wp14">
+<w:footnotes xmlns:wpc="http://schemas.microsoft.com/office/word/2010/wordprocessingCanvas" xmlns:cx="http://schemas.microsoft.com/office/drawing/2014/chartex" xmlns:cx1="http://schemas.microsoft.com/office/drawing/2015/9/8/chartex" xmlns:cx2="http://schemas.microsoft.com/office/drawing/2015/10/21/chartex" xmlns:cx3="http://schemas.microsoft.com/office/drawing/2016/5/9/chartex" xmlns:cx4="http://schemas.microsoft.com/office/drawing/2016/5/10/chartex" xmlns:cx5="http://schemas.microsoft.com/office/drawing/2016/5/11/chartex" xmlns:cx6="http://schemas.microsoft.com/office/drawing/2016/5/12/chartex" xmlns:cx7="http://schemas.microsoft.com/office/drawing/2016/5/13/chartex" xmlns:cx8="http://schemas.microsoft.com/office/drawing/2016/5/14/chartex" xmlns:mc="http://schemas.openxmlformats.org/markup-compatibility/2006" xmlns:aink="http://schemas.microsoft.com/office/drawing/2016/ink" xmlns:am3d="http://schemas.microsoft.com/office/drawing/2017/model3d" xmlns:o="urn:schemas-microsoft-com:office:office" xmlns:r="http://schemas.openxmlformats.org/officeDocument/2006/relationships" xmlns:m="http://schemas.openxmlformats.org/officeDocument/2006/math" xmlns:v="urn:schemas-microsoft-com:vml" xmlns:wp14="http://schemas.microsoft.com/office/word/2010/wordprocessingDrawing" xmlns:wp="http://schemas.openxmlformats.org/drawingml/2006/wordprocessingDrawing" xmlns:w10="urn:schemas-microsoft-com:office:word" xmlns:w="http://schemas.openxmlformats.org/wordprocessingml/2006/main" xmlns:w14="http://schemas.microsoft.com/office/word/2010/wordml" xmlns:w15="http://schemas.microsoft.com/office/word/2012/wordml" xmlns:w16cex="http://schemas.microsoft.com/office/word/2018/wordml/cex" xmlns:w16cid="http://schemas.microsoft.com/office/word/2016/wordml/cid" xmlns:w16="http://schemas.microsoft.com/office/word/2018/wordml" xmlns:w16sdtdh="http://schemas.microsoft.com/office/word/2020/wordml/sdtdatahash" xmlns:w16se="http://schemas.microsoft.com/office/word/2015/wordml/symex" xmlns:wpg="http://schemas.microsoft.com/office/word/2010/wordprocessingGroup" xmlns:wpi="http://schemas.microsoft.com/office/word/2010/wordprocessingInk" xmlns:wne="http://schemas.microsoft.com/office/word/2006/wordml" xmlns:wps="http://schemas.microsoft.com/office/word/2010/wordprocessingShape" mc:Ignorable="w14 w15 w16se w16cid w16 w16cex w16sdtdh wp14">
   <w:footnote w:type="separator" w:id="-1">
     <w:p>
       <w:pPr>
@@ -3024,13 +3745,25 @@
         </w:rPr>
         <w:t xml:space="preserve">Para todos los gráficos que presenten, recuerde tener presentes los tres principios de visualización de datos discutidos en la Clase 1. </w:t>
       </w:r>
+      <w:proofErr w:type="spellStart"/>
       <w:r>
         <w:rPr>
           <w:rFonts w:ascii="Century Schoolbook" w:eastAsia="Century Schoolbook" w:hAnsi="Century Schoolbook" w:cs="Century Schoolbook"/>
           <w:sz w:val="20"/>
           <w:szCs w:val="20"/>
-        </w:rPr>
-        <w:t xml:space="preserve">Referencia: </w:t>
+          <w:lang w:val="en-US"/>
+        </w:rPr>
+        <w:t>Referencia</w:t>
+      </w:r>
+      <w:proofErr w:type="spellEnd"/>
+      <w:r>
+        <w:rPr>
+          <w:rFonts w:ascii="Century Schoolbook" w:eastAsia="Century Schoolbook" w:hAnsi="Century Schoolbook" w:cs="Century Schoolbook"/>
+          <w:sz w:val="20"/>
+          <w:szCs w:val="20"/>
+          <w:lang w:val="en-US"/>
+        </w:rPr>
+        <w:t xml:space="preserve">: </w:t>
       </w:r>
       <w:r>
         <w:rPr>
@@ -3039,6 +3772,7 @@
           <w:color w:val="00663D"/>
           <w:sz w:val="20"/>
           <w:szCs w:val="20"/>
+          <w:lang w:val="en-US"/>
         </w:rPr>
         <w:t>†</w:t>
       </w:r>
@@ -3048,6 +3782,7 @@
           <w:b/>
           <w:sz w:val="20"/>
           <w:szCs w:val="20"/>
+          <w:lang w:val="en-US"/>
         </w:rPr>
         <w:t xml:space="preserve"> </w:t>
       </w:r>
@@ -3057,6 +3792,7 @@
           <w:rFonts w:ascii="Century Schoolbook" w:eastAsia="Century Schoolbook" w:hAnsi="Century Schoolbook" w:cs="Century Schoolbook"/>
           <w:sz w:val="20"/>
           <w:szCs w:val="20"/>
+          <w:lang w:val="en-US"/>
         </w:rPr>
         <w:t>Schwabish</w:t>
       </w:r>
@@ -3066,80 +3802,9 @@
           <w:rFonts w:ascii="Century Schoolbook" w:eastAsia="Century Schoolbook" w:hAnsi="Century Schoolbook" w:cs="Century Schoolbook"/>
           <w:sz w:val="20"/>
           <w:szCs w:val="20"/>
-        </w:rPr>
-        <w:t xml:space="preserve">, J. A. (2014). </w:t>
-      </w:r>
-      <w:proofErr w:type="spellStart"/>
-      <w:r>
-        <w:rPr>
-          <w:rFonts w:ascii="Century Schoolbook" w:eastAsia="Century Schoolbook" w:hAnsi="Century Schoolbook" w:cs="Century Schoolbook"/>
-          <w:sz w:val="20"/>
-          <w:szCs w:val="20"/>
-        </w:rPr>
-        <w:t>An</w:t>
-      </w:r>
-      <w:proofErr w:type="spellEnd"/>
-      <w:r>
-        <w:rPr>
-          <w:rFonts w:ascii="Century Schoolbook" w:eastAsia="Century Schoolbook" w:hAnsi="Century Schoolbook" w:cs="Century Schoolbook"/>
-          <w:sz w:val="20"/>
-          <w:szCs w:val="20"/>
-        </w:rPr>
-        <w:t xml:space="preserve"> </w:t>
-      </w:r>
-      <w:proofErr w:type="spellStart"/>
-      <w:r>
-        <w:rPr>
-          <w:rFonts w:ascii="Century Schoolbook" w:eastAsia="Century Schoolbook" w:hAnsi="Century Schoolbook" w:cs="Century Schoolbook"/>
-          <w:sz w:val="20"/>
-          <w:szCs w:val="20"/>
-        </w:rPr>
-        <w:t>economist's</w:t>
-      </w:r>
-      <w:proofErr w:type="spellEnd"/>
-      <w:r>
-        <w:rPr>
-          <w:rFonts w:ascii="Century Schoolbook" w:eastAsia="Century Schoolbook" w:hAnsi="Century Schoolbook" w:cs="Century Schoolbook"/>
-          <w:sz w:val="20"/>
-          <w:szCs w:val="20"/>
-        </w:rPr>
-        <w:t xml:space="preserve"> guide </w:t>
-      </w:r>
-      <w:proofErr w:type="spellStart"/>
-      <w:r>
-        <w:rPr>
-          <w:rFonts w:ascii="Century Schoolbook" w:eastAsia="Century Schoolbook" w:hAnsi="Century Schoolbook" w:cs="Century Schoolbook"/>
-          <w:sz w:val="20"/>
-          <w:szCs w:val="20"/>
-        </w:rPr>
-        <w:t>to</w:t>
-      </w:r>
-      <w:proofErr w:type="spellEnd"/>
-      <w:r>
-        <w:rPr>
-          <w:rFonts w:ascii="Century Schoolbook" w:eastAsia="Century Schoolbook" w:hAnsi="Century Schoolbook" w:cs="Century Schoolbook"/>
-          <w:sz w:val="20"/>
-          <w:szCs w:val="20"/>
-        </w:rPr>
-        <w:t xml:space="preserve"> </w:t>
-      </w:r>
-      <w:proofErr w:type="spellStart"/>
-      <w:r>
-        <w:rPr>
-          <w:rFonts w:ascii="Century Schoolbook" w:eastAsia="Century Schoolbook" w:hAnsi="Century Schoolbook" w:cs="Century Schoolbook"/>
-          <w:sz w:val="20"/>
-          <w:szCs w:val="20"/>
-        </w:rPr>
-        <w:t>visualizing</w:t>
-      </w:r>
-      <w:proofErr w:type="spellEnd"/>
-      <w:r>
-        <w:rPr>
-          <w:rFonts w:ascii="Century Schoolbook" w:eastAsia="Century Schoolbook" w:hAnsi="Century Schoolbook" w:cs="Century Schoolbook"/>
-          <w:sz w:val="20"/>
-          <w:szCs w:val="20"/>
-        </w:rPr>
-        <w:t xml:space="preserve"> data</w:t>
+          <w:lang w:val="en-US"/>
+        </w:rPr>
+        <w:t>, J. A. (2014). An economist's guide to visualizing data</w:t>
       </w:r>
       <w:r>
         <w:rPr>
@@ -3147,6 +3812,7 @@
           <w:i/>
           <w:sz w:val="20"/>
           <w:szCs w:val="20"/>
+          <w:lang w:val="en-US"/>
         </w:rPr>
         <w:t xml:space="preserve">. </w:t>
       </w:r>
@@ -3397,7 +4063,7 @@
 </file>
 
 <file path=word/header1.xml><?xml version="1.0" encoding="utf-8"?>
-<w:hdr xmlns:wpc="http://schemas.microsoft.com/office/word/2010/wordprocessingCanvas" xmlns:cx="http://schemas.microsoft.com/office/drawing/2014/chartex" xmlns:cx1="http://schemas.microsoft.com/office/drawing/2015/9/8/chartex" xmlns:cx2="http://schemas.microsoft.com/office/drawing/2015/10/21/chartex" xmlns:cx3="http://schemas.microsoft.com/office/drawing/2016/5/9/chartex" xmlns:cx4="http://schemas.microsoft.com/office/drawing/2016/5/10/chartex" xmlns:cx5="http://schemas.microsoft.com/office/drawing/2016/5/11/chartex" xmlns:cx6="http://schemas.microsoft.com/office/drawing/2016/5/12/chartex" xmlns:cx7="http://schemas.microsoft.com/office/drawing/2016/5/13/chartex" xmlns:cx8="http://schemas.microsoft.com/office/drawing/2016/5/14/chartex" xmlns:mc="http://schemas.openxmlformats.org/markup-compatibility/2006" xmlns:aink="http://schemas.microsoft.com/office/drawing/2016/ink" xmlns:am3d="http://schemas.microsoft.com/office/drawing/2017/model3d" xmlns:o="urn:schemas-microsoft-com:office:office" xmlns:oel="http://schemas.microsoft.com/office/2019/extlst" xmlns:r="http://schemas.openxmlformats.org/officeDocument/2006/relationships" xmlns:m="http://schemas.openxmlformats.org/officeDocument/2006/math" xmlns:v="urn:schemas-microsoft-com:vml" xmlns:wp14="http://schemas.microsoft.com/office/word/2010/wordprocessingDrawing" xmlns:wp="http://schemas.openxmlformats.org/drawingml/2006/wordprocessingDrawing" xmlns:w10="urn:schemas-microsoft-com:office:word" xmlns:w="http://schemas.openxmlformats.org/wordprocessingml/2006/main" xmlns:w14="http://schemas.microsoft.com/office/word/2010/wordml" xmlns:w15="http://schemas.microsoft.com/office/word/2012/wordml" xmlns:w16cex="http://schemas.microsoft.com/office/word/2018/wordml/cex" xmlns:w16cid="http://schemas.microsoft.com/office/word/2016/wordml/cid" xmlns:w16="http://schemas.microsoft.com/office/word/2018/wordml" xmlns:w16sdtdh="http://schemas.microsoft.com/office/word/2020/wordml/sdtdatahash" xmlns:w16se="http://schemas.microsoft.com/office/word/2015/wordml/symex" xmlns:wpg="http://schemas.microsoft.com/office/word/2010/wordprocessingGroup" xmlns:wpi="http://schemas.microsoft.com/office/word/2010/wordprocessingInk" xmlns:wne="http://schemas.microsoft.com/office/word/2006/wordml" xmlns:wps="http://schemas.microsoft.com/office/word/2010/wordprocessingShape" mc:Ignorable="w14 w15 w16se w16cid w16 w16cex w16sdtdh wp14">
+<w:hdr xmlns:wpc="http://schemas.microsoft.com/office/word/2010/wordprocessingCanvas" xmlns:cx="http://schemas.microsoft.com/office/drawing/2014/chartex" xmlns:cx1="http://schemas.microsoft.com/office/drawing/2015/9/8/chartex" xmlns:cx2="http://schemas.microsoft.com/office/drawing/2015/10/21/chartex" xmlns:cx3="http://schemas.microsoft.com/office/drawing/2016/5/9/chartex" xmlns:cx4="http://schemas.microsoft.com/office/drawing/2016/5/10/chartex" xmlns:cx5="http://schemas.microsoft.com/office/drawing/2016/5/11/chartex" xmlns:cx6="http://schemas.microsoft.com/office/drawing/2016/5/12/chartex" xmlns:cx7="http://schemas.microsoft.com/office/drawing/2016/5/13/chartex" xmlns:cx8="http://schemas.microsoft.com/office/drawing/2016/5/14/chartex" xmlns:mc="http://schemas.openxmlformats.org/markup-compatibility/2006" xmlns:aink="http://schemas.microsoft.com/office/drawing/2016/ink" xmlns:am3d="http://schemas.microsoft.com/office/drawing/2017/model3d" xmlns:o="urn:schemas-microsoft-com:office:office" xmlns:r="http://schemas.openxmlformats.org/officeDocument/2006/relationships" xmlns:m="http://schemas.openxmlformats.org/officeDocument/2006/math" xmlns:v="urn:schemas-microsoft-com:vml" xmlns:wp14="http://schemas.microsoft.com/office/word/2010/wordprocessingDrawing" xmlns:wp="http://schemas.openxmlformats.org/drawingml/2006/wordprocessingDrawing" xmlns:w10="urn:schemas-microsoft-com:office:word" xmlns:w="http://schemas.openxmlformats.org/wordprocessingml/2006/main" xmlns:w14="http://schemas.microsoft.com/office/word/2010/wordml" xmlns:w15="http://schemas.microsoft.com/office/word/2012/wordml" xmlns:w16cex="http://schemas.microsoft.com/office/word/2018/wordml/cex" xmlns:w16cid="http://schemas.microsoft.com/office/word/2016/wordml/cid" xmlns:w16="http://schemas.microsoft.com/office/word/2018/wordml" xmlns:w16sdtdh="http://schemas.microsoft.com/office/word/2020/wordml/sdtdatahash" xmlns:w16se="http://schemas.microsoft.com/office/word/2015/wordml/symex" xmlns:wpg="http://schemas.microsoft.com/office/word/2010/wordprocessingGroup" xmlns:wpi="http://schemas.microsoft.com/office/word/2010/wordprocessingInk" xmlns:wne="http://schemas.microsoft.com/office/word/2006/wordml" xmlns:wps="http://schemas.microsoft.com/office/word/2010/wordprocessingShape" mc:Ignorable="w14 w15 w16se w16cid w16 w16cex w16sdtdh wp14">
   <w:p>
     <w:pPr>
       <w:pStyle w:val="Encabezado"/>
@@ -3418,7 +4084,7 @@
 </file>
 
 <file path=word/numbering.xml><?xml version="1.0" encoding="utf-8"?>
-<w:numbering xmlns:wpc="http://schemas.microsoft.com/office/word/2010/wordprocessingCanvas" xmlns:cx="http://schemas.microsoft.com/office/drawing/2014/chartex" xmlns:cx1="http://schemas.microsoft.com/office/drawing/2015/9/8/chartex" xmlns:cx2="http://schemas.microsoft.com/office/drawing/2015/10/21/chartex" xmlns:cx3="http://schemas.microsoft.com/office/drawing/2016/5/9/chartex" xmlns:cx4="http://schemas.microsoft.com/office/drawing/2016/5/10/chartex" xmlns:cx5="http://schemas.microsoft.com/office/drawing/2016/5/11/chartex" xmlns:cx6="http://schemas.microsoft.com/office/drawing/2016/5/12/chartex" xmlns:cx7="http://schemas.microsoft.com/office/drawing/2016/5/13/chartex" xmlns:cx8="http://schemas.microsoft.com/office/drawing/2016/5/14/chartex" xmlns:mc="http://schemas.openxmlformats.org/markup-compatibility/2006" xmlns:aink="http://schemas.microsoft.com/office/drawing/2016/ink" xmlns:am3d="http://schemas.microsoft.com/office/drawing/2017/model3d" xmlns:o="urn:schemas-microsoft-com:office:office" xmlns:oel="http://schemas.microsoft.com/office/2019/extlst" xmlns:r="http://schemas.openxmlformats.org/officeDocument/2006/relationships" xmlns:m="http://schemas.openxmlformats.org/officeDocument/2006/math" xmlns:v="urn:schemas-microsoft-com:vml" xmlns:wp14="http://schemas.microsoft.com/office/word/2010/wordprocessingDrawing" xmlns:wp="http://schemas.openxmlformats.org/drawingml/2006/wordprocessingDrawing" xmlns:w10="urn:schemas-microsoft-com:office:word" xmlns:w="http://schemas.openxmlformats.org/wordprocessingml/2006/main" xmlns:w14="http://schemas.microsoft.com/office/word/2010/wordml" xmlns:w15="http://schemas.microsoft.com/office/word/2012/wordml" xmlns:w16cex="http://schemas.microsoft.com/office/word/2018/wordml/cex" xmlns:w16cid="http://schemas.microsoft.com/office/word/2016/wordml/cid" xmlns:w16="http://schemas.microsoft.com/office/word/2018/wordml" xmlns:w16sdtdh="http://schemas.microsoft.com/office/word/2020/wordml/sdtdatahash" xmlns:w16se="http://schemas.microsoft.com/office/word/2015/wordml/symex" xmlns:wpg="http://schemas.microsoft.com/office/word/2010/wordprocessingGroup" xmlns:wpi="http://schemas.microsoft.com/office/word/2010/wordprocessingInk" xmlns:wne="http://schemas.microsoft.com/office/word/2006/wordml" xmlns:wps="http://schemas.microsoft.com/office/word/2010/wordprocessingShape" mc:Ignorable="w14 w15 w16se w16cid w16 w16cex w16sdtdh wp14">
+<w:numbering xmlns:wpc="http://schemas.microsoft.com/office/word/2010/wordprocessingCanvas" xmlns:cx="http://schemas.microsoft.com/office/drawing/2014/chartex" xmlns:cx1="http://schemas.microsoft.com/office/drawing/2015/9/8/chartex" xmlns:cx2="http://schemas.microsoft.com/office/drawing/2015/10/21/chartex" xmlns:cx3="http://schemas.microsoft.com/office/drawing/2016/5/9/chartex" xmlns:cx4="http://schemas.microsoft.com/office/drawing/2016/5/10/chartex" xmlns:cx5="http://schemas.microsoft.com/office/drawing/2016/5/11/chartex" xmlns:cx6="http://schemas.microsoft.com/office/drawing/2016/5/12/chartex" xmlns:cx7="http://schemas.microsoft.com/office/drawing/2016/5/13/chartex" xmlns:cx8="http://schemas.microsoft.com/office/drawing/2016/5/14/chartex" xmlns:mc="http://schemas.openxmlformats.org/markup-compatibility/2006" xmlns:aink="http://schemas.microsoft.com/office/drawing/2016/ink" xmlns:am3d="http://schemas.microsoft.com/office/drawing/2017/model3d" xmlns:o="urn:schemas-microsoft-com:office:office" xmlns:r="http://schemas.openxmlformats.org/officeDocument/2006/relationships" xmlns:m="http://schemas.openxmlformats.org/officeDocument/2006/math" xmlns:v="urn:schemas-microsoft-com:vml" xmlns:wp14="http://schemas.microsoft.com/office/word/2010/wordprocessingDrawing" xmlns:wp="http://schemas.openxmlformats.org/drawingml/2006/wordprocessingDrawing" xmlns:w10="urn:schemas-microsoft-com:office:word" xmlns:w="http://schemas.openxmlformats.org/wordprocessingml/2006/main" xmlns:w14="http://schemas.microsoft.com/office/word/2010/wordml" xmlns:w15="http://schemas.microsoft.com/office/word/2012/wordml" xmlns:w16cex="http://schemas.microsoft.com/office/word/2018/wordml/cex" xmlns:w16cid="http://schemas.microsoft.com/office/word/2016/wordml/cid" xmlns:w16="http://schemas.microsoft.com/office/word/2018/wordml" xmlns:w16sdtdh="http://schemas.microsoft.com/office/word/2020/wordml/sdtdatahash" xmlns:w16se="http://schemas.microsoft.com/office/word/2015/wordml/symex" xmlns:wpg="http://schemas.microsoft.com/office/word/2010/wordprocessingGroup" xmlns:wpi="http://schemas.microsoft.com/office/word/2010/wordprocessingInk" xmlns:wne="http://schemas.microsoft.com/office/word/2006/wordml" xmlns:wps="http://schemas.microsoft.com/office/word/2010/wordprocessingShape" mc:Ignorable="w14 w15 w16se w16cid w16 w16cex w16sdtdh wp14">
   <w:abstractNum w:abstractNumId="0" w15:restartNumberingAfterBreak="0">
     <w:nsid w:val="1BA65C3A"/>
     <w:multiLevelType w:val="hybridMultilevel"/>
@@ -4043,6 +4709,119 @@
     </w:lvl>
   </w:abstractNum>
   <w:abstractNum w:abstractNumId="4" w15:restartNumberingAfterBreak="0">
+    <w:nsid w:val="3D0523F9"/>
+    <w:multiLevelType w:val="multilevel"/>
+    <w:tmpl w:val="65FE5BF0"/>
+    <w:lvl w:ilvl="0">
+      <w:start w:val="3"/>
+      <w:numFmt w:val="decimal"/>
+      <w:lvlText w:val="%1."/>
+      <w:lvlJc w:val="left"/>
+      <w:pPr>
+        <w:ind w:left="502" w:hanging="360"/>
+      </w:pPr>
+      <w:rPr>
+        <w:rFonts w:hint="default"/>
+      </w:rPr>
+    </w:lvl>
+    <w:lvl w:ilvl="1">
+      <w:start w:val="1"/>
+      <w:numFmt w:val="lowerLetter"/>
+      <w:lvlText w:val="%2."/>
+      <w:lvlJc w:val="left"/>
+      <w:pPr>
+        <w:ind w:left="1440" w:hanging="360"/>
+      </w:pPr>
+      <w:rPr>
+        <w:rFonts w:hint="default"/>
+      </w:rPr>
+    </w:lvl>
+    <w:lvl w:ilvl="2">
+      <w:start w:val="1"/>
+      <w:numFmt w:val="lowerRoman"/>
+      <w:lvlText w:val="%3."/>
+      <w:lvlJc w:val="right"/>
+      <w:pPr>
+        <w:ind w:left="2160" w:hanging="180"/>
+      </w:pPr>
+      <w:rPr>
+        <w:rFonts w:hint="default"/>
+      </w:rPr>
+    </w:lvl>
+    <w:lvl w:ilvl="3">
+      <w:start w:val="1"/>
+      <w:numFmt w:val="decimal"/>
+      <w:lvlText w:val="%4."/>
+      <w:lvlJc w:val="left"/>
+      <w:pPr>
+        <w:ind w:left="2880" w:hanging="360"/>
+      </w:pPr>
+      <w:rPr>
+        <w:rFonts w:hint="default"/>
+      </w:rPr>
+    </w:lvl>
+    <w:lvl w:ilvl="4">
+      <w:start w:val="1"/>
+      <w:numFmt w:val="lowerLetter"/>
+      <w:lvlText w:val="%5."/>
+      <w:lvlJc w:val="left"/>
+      <w:pPr>
+        <w:ind w:left="3600" w:hanging="360"/>
+      </w:pPr>
+      <w:rPr>
+        <w:rFonts w:hint="default"/>
+      </w:rPr>
+    </w:lvl>
+    <w:lvl w:ilvl="5">
+      <w:start w:val="1"/>
+      <w:numFmt w:val="lowerRoman"/>
+      <w:lvlText w:val="%6."/>
+      <w:lvlJc w:val="right"/>
+      <w:pPr>
+        <w:ind w:left="4320" w:hanging="180"/>
+      </w:pPr>
+      <w:rPr>
+        <w:rFonts w:hint="default"/>
+      </w:rPr>
+    </w:lvl>
+    <w:lvl w:ilvl="6">
+      <w:start w:val="1"/>
+      <w:numFmt w:val="decimal"/>
+      <w:lvlText w:val="%7."/>
+      <w:lvlJc w:val="left"/>
+      <w:pPr>
+        <w:ind w:left="5040" w:hanging="360"/>
+      </w:pPr>
+      <w:rPr>
+        <w:rFonts w:hint="default"/>
+      </w:rPr>
+    </w:lvl>
+    <w:lvl w:ilvl="7">
+      <w:start w:val="1"/>
+      <w:numFmt w:val="lowerLetter"/>
+      <w:lvlText w:val="%8."/>
+      <w:lvlJc w:val="left"/>
+      <w:pPr>
+        <w:ind w:left="5760" w:hanging="360"/>
+      </w:pPr>
+      <w:rPr>
+        <w:rFonts w:hint="default"/>
+      </w:rPr>
+    </w:lvl>
+    <w:lvl w:ilvl="8">
+      <w:start w:val="1"/>
+      <w:numFmt w:val="lowerRoman"/>
+      <w:lvlText w:val="%9."/>
+      <w:lvlJc w:val="right"/>
+      <w:pPr>
+        <w:ind w:left="6480" w:hanging="180"/>
+      </w:pPr>
+      <w:rPr>
+        <w:rFonts w:hint="default"/>
+      </w:rPr>
+    </w:lvl>
+  </w:abstractNum>
+  <w:abstractNum w:abstractNumId="5" w15:restartNumberingAfterBreak="0">
     <w:nsid w:val="5DFD6E27"/>
     <w:multiLevelType w:val="multilevel"/>
     <w:tmpl w:val="32D21CD6"/>
@@ -4128,7 +4907,305 @@
       </w:pPr>
     </w:lvl>
   </w:abstractNum>
-  <w:abstractNum w:abstractNumId="5" w15:restartNumberingAfterBreak="0">
+  <w:abstractNum w:abstractNumId="6" w15:restartNumberingAfterBreak="0">
+    <w:nsid w:val="6A161976"/>
+    <w:multiLevelType w:val="multilevel"/>
+    <w:tmpl w:val="FC7230AC"/>
+    <w:lvl w:ilvl="0">
+      <w:start w:val="1"/>
+      <w:numFmt w:val="bullet"/>
+      <w:lvlText w:val=""/>
+      <w:lvlJc w:val="left"/>
+      <w:pPr>
+        <w:tabs>
+          <w:tab w:val="num" w:pos="720"/>
+        </w:tabs>
+        <w:ind w:left="720" w:hanging="360"/>
+      </w:pPr>
+      <w:rPr>
+        <w:rFonts w:ascii="Symbol" w:hAnsi="Symbol" w:hint="default"/>
+        <w:sz w:val="20"/>
+      </w:rPr>
+    </w:lvl>
+    <w:lvl w:ilvl="1" w:tentative="1">
+      <w:start w:val="1"/>
+      <w:numFmt w:val="bullet"/>
+      <w:lvlText w:val="o"/>
+      <w:lvlJc w:val="left"/>
+      <w:pPr>
+        <w:tabs>
+          <w:tab w:val="num" w:pos="1440"/>
+        </w:tabs>
+        <w:ind w:left="1440" w:hanging="360"/>
+      </w:pPr>
+      <w:rPr>
+        <w:rFonts w:ascii="Courier New" w:hAnsi="Courier New" w:hint="default"/>
+        <w:sz w:val="20"/>
+      </w:rPr>
+    </w:lvl>
+    <w:lvl w:ilvl="2" w:tentative="1">
+      <w:start w:val="1"/>
+      <w:numFmt w:val="bullet"/>
+      <w:lvlText w:val=""/>
+      <w:lvlJc w:val="left"/>
+      <w:pPr>
+        <w:tabs>
+          <w:tab w:val="num" w:pos="2160"/>
+        </w:tabs>
+        <w:ind w:left="2160" w:hanging="360"/>
+      </w:pPr>
+      <w:rPr>
+        <w:rFonts w:ascii="Wingdings" w:hAnsi="Wingdings" w:hint="default"/>
+        <w:sz w:val="20"/>
+      </w:rPr>
+    </w:lvl>
+    <w:lvl w:ilvl="3" w:tentative="1">
+      <w:start w:val="1"/>
+      <w:numFmt w:val="bullet"/>
+      <w:lvlText w:val=""/>
+      <w:lvlJc w:val="left"/>
+      <w:pPr>
+        <w:tabs>
+          <w:tab w:val="num" w:pos="2880"/>
+        </w:tabs>
+        <w:ind w:left="2880" w:hanging="360"/>
+      </w:pPr>
+      <w:rPr>
+        <w:rFonts w:ascii="Wingdings" w:hAnsi="Wingdings" w:hint="default"/>
+        <w:sz w:val="20"/>
+      </w:rPr>
+    </w:lvl>
+    <w:lvl w:ilvl="4" w:tentative="1">
+      <w:start w:val="1"/>
+      <w:numFmt w:val="bullet"/>
+      <w:lvlText w:val=""/>
+      <w:lvlJc w:val="left"/>
+      <w:pPr>
+        <w:tabs>
+          <w:tab w:val="num" w:pos="3600"/>
+        </w:tabs>
+        <w:ind w:left="3600" w:hanging="360"/>
+      </w:pPr>
+      <w:rPr>
+        <w:rFonts w:ascii="Wingdings" w:hAnsi="Wingdings" w:hint="default"/>
+        <w:sz w:val="20"/>
+      </w:rPr>
+    </w:lvl>
+    <w:lvl w:ilvl="5" w:tentative="1">
+      <w:start w:val="1"/>
+      <w:numFmt w:val="bullet"/>
+      <w:lvlText w:val=""/>
+      <w:lvlJc w:val="left"/>
+      <w:pPr>
+        <w:tabs>
+          <w:tab w:val="num" w:pos="4320"/>
+        </w:tabs>
+        <w:ind w:left="4320" w:hanging="360"/>
+      </w:pPr>
+      <w:rPr>
+        <w:rFonts w:ascii="Wingdings" w:hAnsi="Wingdings" w:hint="default"/>
+        <w:sz w:val="20"/>
+      </w:rPr>
+    </w:lvl>
+    <w:lvl w:ilvl="6" w:tentative="1">
+      <w:start w:val="1"/>
+      <w:numFmt w:val="bullet"/>
+      <w:lvlText w:val=""/>
+      <w:lvlJc w:val="left"/>
+      <w:pPr>
+        <w:tabs>
+          <w:tab w:val="num" w:pos="5040"/>
+        </w:tabs>
+        <w:ind w:left="5040" w:hanging="360"/>
+      </w:pPr>
+      <w:rPr>
+        <w:rFonts w:ascii="Wingdings" w:hAnsi="Wingdings" w:hint="default"/>
+        <w:sz w:val="20"/>
+      </w:rPr>
+    </w:lvl>
+    <w:lvl w:ilvl="7" w:tentative="1">
+      <w:start w:val="1"/>
+      <w:numFmt w:val="bullet"/>
+      <w:lvlText w:val=""/>
+      <w:lvlJc w:val="left"/>
+      <w:pPr>
+        <w:tabs>
+          <w:tab w:val="num" w:pos="5760"/>
+        </w:tabs>
+        <w:ind w:left="5760" w:hanging="360"/>
+      </w:pPr>
+      <w:rPr>
+        <w:rFonts w:ascii="Wingdings" w:hAnsi="Wingdings" w:hint="default"/>
+        <w:sz w:val="20"/>
+      </w:rPr>
+    </w:lvl>
+    <w:lvl w:ilvl="8" w:tentative="1">
+      <w:start w:val="1"/>
+      <w:numFmt w:val="bullet"/>
+      <w:lvlText w:val=""/>
+      <w:lvlJc w:val="left"/>
+      <w:pPr>
+        <w:tabs>
+          <w:tab w:val="num" w:pos="6480"/>
+        </w:tabs>
+        <w:ind w:left="6480" w:hanging="360"/>
+      </w:pPr>
+      <w:rPr>
+        <w:rFonts w:ascii="Wingdings" w:hAnsi="Wingdings" w:hint="default"/>
+        <w:sz w:val="20"/>
+      </w:rPr>
+    </w:lvl>
+  </w:abstractNum>
+  <w:abstractNum w:abstractNumId="7" w15:restartNumberingAfterBreak="0">
+    <w:nsid w:val="77595956"/>
+    <w:multiLevelType w:val="multilevel"/>
+    <w:tmpl w:val="16368328"/>
+    <w:lvl w:ilvl="0">
+      <w:start w:val="1"/>
+      <w:numFmt w:val="bullet"/>
+      <w:lvlText w:val=""/>
+      <w:lvlJc w:val="left"/>
+      <w:pPr>
+        <w:tabs>
+          <w:tab w:val="num" w:pos="720"/>
+        </w:tabs>
+        <w:ind w:left="720" w:hanging="360"/>
+      </w:pPr>
+      <w:rPr>
+        <w:rFonts w:ascii="Symbol" w:hAnsi="Symbol" w:hint="default"/>
+        <w:sz w:val="20"/>
+      </w:rPr>
+    </w:lvl>
+    <w:lvl w:ilvl="1" w:tentative="1">
+      <w:start w:val="1"/>
+      <w:numFmt w:val="bullet"/>
+      <w:lvlText w:val="o"/>
+      <w:lvlJc w:val="left"/>
+      <w:pPr>
+        <w:tabs>
+          <w:tab w:val="num" w:pos="1440"/>
+        </w:tabs>
+        <w:ind w:left="1440" w:hanging="360"/>
+      </w:pPr>
+      <w:rPr>
+        <w:rFonts w:ascii="Courier New" w:hAnsi="Courier New" w:hint="default"/>
+        <w:sz w:val="20"/>
+      </w:rPr>
+    </w:lvl>
+    <w:lvl w:ilvl="2" w:tentative="1">
+      <w:start w:val="1"/>
+      <w:numFmt w:val="bullet"/>
+      <w:lvlText w:val=""/>
+      <w:lvlJc w:val="left"/>
+      <w:pPr>
+        <w:tabs>
+          <w:tab w:val="num" w:pos="2160"/>
+        </w:tabs>
+        <w:ind w:left="2160" w:hanging="360"/>
+      </w:pPr>
+      <w:rPr>
+        <w:rFonts w:ascii="Wingdings" w:hAnsi="Wingdings" w:hint="default"/>
+        <w:sz w:val="20"/>
+      </w:rPr>
+    </w:lvl>
+    <w:lvl w:ilvl="3" w:tentative="1">
+      <w:start w:val="1"/>
+      <w:numFmt w:val="bullet"/>
+      <w:lvlText w:val=""/>
+      <w:lvlJc w:val="left"/>
+      <w:pPr>
+        <w:tabs>
+          <w:tab w:val="num" w:pos="2880"/>
+        </w:tabs>
+        <w:ind w:left="2880" w:hanging="360"/>
+      </w:pPr>
+      <w:rPr>
+        <w:rFonts w:ascii="Wingdings" w:hAnsi="Wingdings" w:hint="default"/>
+        <w:sz w:val="20"/>
+      </w:rPr>
+    </w:lvl>
+    <w:lvl w:ilvl="4" w:tentative="1">
+      <w:start w:val="1"/>
+      <w:numFmt w:val="bullet"/>
+      <w:lvlText w:val=""/>
+      <w:lvlJc w:val="left"/>
+      <w:pPr>
+        <w:tabs>
+          <w:tab w:val="num" w:pos="3600"/>
+        </w:tabs>
+        <w:ind w:left="3600" w:hanging="360"/>
+      </w:pPr>
+      <w:rPr>
+        <w:rFonts w:ascii="Wingdings" w:hAnsi="Wingdings" w:hint="default"/>
+        <w:sz w:val="20"/>
+      </w:rPr>
+    </w:lvl>
+    <w:lvl w:ilvl="5" w:tentative="1">
+      <w:start w:val="1"/>
+      <w:numFmt w:val="bullet"/>
+      <w:lvlText w:val=""/>
+      <w:lvlJc w:val="left"/>
+      <w:pPr>
+        <w:tabs>
+          <w:tab w:val="num" w:pos="4320"/>
+        </w:tabs>
+        <w:ind w:left="4320" w:hanging="360"/>
+      </w:pPr>
+      <w:rPr>
+        <w:rFonts w:ascii="Wingdings" w:hAnsi="Wingdings" w:hint="default"/>
+        <w:sz w:val="20"/>
+      </w:rPr>
+    </w:lvl>
+    <w:lvl w:ilvl="6" w:tentative="1">
+      <w:start w:val="1"/>
+      <w:numFmt w:val="bullet"/>
+      <w:lvlText w:val=""/>
+      <w:lvlJc w:val="left"/>
+      <w:pPr>
+        <w:tabs>
+          <w:tab w:val="num" w:pos="5040"/>
+        </w:tabs>
+        <w:ind w:left="5040" w:hanging="360"/>
+      </w:pPr>
+      <w:rPr>
+        <w:rFonts w:ascii="Wingdings" w:hAnsi="Wingdings" w:hint="default"/>
+        <w:sz w:val="20"/>
+      </w:rPr>
+    </w:lvl>
+    <w:lvl w:ilvl="7" w:tentative="1">
+      <w:start w:val="1"/>
+      <w:numFmt w:val="bullet"/>
+      <w:lvlText w:val=""/>
+      <w:lvlJc w:val="left"/>
+      <w:pPr>
+        <w:tabs>
+          <w:tab w:val="num" w:pos="5760"/>
+        </w:tabs>
+        <w:ind w:left="5760" w:hanging="360"/>
+      </w:pPr>
+      <w:rPr>
+        <w:rFonts w:ascii="Wingdings" w:hAnsi="Wingdings" w:hint="default"/>
+        <w:sz w:val="20"/>
+      </w:rPr>
+    </w:lvl>
+    <w:lvl w:ilvl="8" w:tentative="1">
+      <w:start w:val="1"/>
+      <w:numFmt w:val="bullet"/>
+      <w:lvlText w:val=""/>
+      <w:lvlJc w:val="left"/>
+      <w:pPr>
+        <w:tabs>
+          <w:tab w:val="num" w:pos="6480"/>
+        </w:tabs>
+        <w:ind w:left="6480" w:hanging="360"/>
+      </w:pPr>
+      <w:rPr>
+        <w:rFonts w:ascii="Wingdings" w:hAnsi="Wingdings" w:hint="default"/>
+        <w:sz w:val="20"/>
+      </w:rPr>
+    </w:lvl>
+  </w:abstractNum>
+  <w:abstractNum w:abstractNumId="8" w15:restartNumberingAfterBreak="0">
     <w:nsid w:val="79DC40BA"/>
     <w:multiLevelType w:val="multilevel"/>
     <w:tmpl w:val="C47C830A"/>
@@ -4245,23 +5322,32 @@
       </w:pPr>
     </w:lvl>
   </w:abstractNum>
-  <w:num w:numId="1" w16cid:durableId="1274480832">
+  <w:num w:numId="1">
     <w:abstractNumId w:val="1"/>
   </w:num>
-  <w:num w:numId="2" w16cid:durableId="712388272">
+  <w:num w:numId="2">
+    <w:abstractNumId w:val="5"/>
+  </w:num>
+  <w:num w:numId="3">
+    <w:abstractNumId w:val="2"/>
+  </w:num>
+  <w:num w:numId="4">
+    <w:abstractNumId w:val="3"/>
+  </w:num>
+  <w:num w:numId="5">
+    <w:abstractNumId w:val="8"/>
+  </w:num>
+  <w:num w:numId="6">
+    <w:abstractNumId w:val="0"/>
+  </w:num>
+  <w:num w:numId="7">
     <w:abstractNumId w:val="4"/>
   </w:num>
-  <w:num w:numId="3" w16cid:durableId="2095124838">
-    <w:abstractNumId w:val="2"/>
+  <w:num w:numId="8">
+    <w:abstractNumId w:val="6"/>
   </w:num>
-  <w:num w:numId="4" w16cid:durableId="1596206639">
-    <w:abstractNumId w:val="3"/>
-  </w:num>
-  <w:num w:numId="5" w16cid:durableId="1206991911">
-    <w:abstractNumId w:val="5"/>
-  </w:num>
-  <w:num w:numId="6" w16cid:durableId="1185367554">
-    <w:abstractNumId w:val="0"/>
+  <w:num w:numId="9">
+    <w:abstractNumId w:val="7"/>
   </w:num>
 </w:numbering>
 </file>
@@ -4740,9 +5826,31 @@
       <w:sz w:val="24"/>
     </w:rPr>
   </w:style>
+  <w:style w:type="paragraph" w:styleId="Ttulo5">
+    <w:name w:val="heading 5"/>
+    <w:basedOn w:val="Normal"/>
+    <w:next w:val="Normal"/>
+    <w:link w:val="Ttulo5Car"/>
+    <w:uiPriority w:val="9"/>
+    <w:semiHidden/>
+    <w:unhideWhenUsed/>
+    <w:qFormat/>
+    <w:rsid w:val="00344598"/>
+    <w:pPr>
+      <w:keepNext/>
+      <w:keepLines/>
+      <w:spacing w:before="40" w:after="0"/>
+      <w:outlineLvl w:val="4"/>
+    </w:pPr>
+    <w:rPr>
+      <w:rFonts w:asciiTheme="majorHAnsi" w:eastAsiaTheme="majorEastAsia" w:hAnsiTheme="majorHAnsi" w:cstheme="majorBidi"/>
+      <w:color w:val="0F4761" w:themeColor="accent1" w:themeShade="BF"/>
+    </w:rPr>
+  </w:style>
   <w:style w:type="character" w:default="1" w:styleId="Fuentedeprrafopredeter">
     <w:name w:val="Default Paragraph Font"/>
     <w:uiPriority w:val="1"/>
+    <w:semiHidden/>
     <w:unhideWhenUsed/>
   </w:style>
   <w:style w:type="table" w:default="1" w:styleId="Tablanormal">
@@ -4973,6 +6081,49 @@
       <w:ind w:left="720"/>
       <w:contextualSpacing/>
     </w:pPr>
+  </w:style>
+  <w:style w:type="paragraph" w:styleId="NormalWeb">
+    <w:name w:val="Normal (Web)"/>
+    <w:basedOn w:val="Normal"/>
+    <w:uiPriority w:val="99"/>
+    <w:unhideWhenUsed/>
+    <w:rsid w:val="001A7DDD"/>
+    <w:pPr>
+      <w:spacing w:before="100" w:beforeAutospacing="1" w:after="100" w:afterAutospacing="1" w:line="240" w:lineRule="auto"/>
+      <w:ind w:left="0" w:firstLine="0"/>
+    </w:pPr>
+    <w:rPr>
+      <w:rFonts w:ascii="Times New Roman" w:eastAsia="Times New Roman" w:hAnsi="Times New Roman" w:cs="Times New Roman"/>
+      <w:color w:val="auto"/>
+      <w:kern w:val="0"/>
+      <w:sz w:val="24"/>
+      <w:lang w:val="es-AR" w:eastAsia="es-AR"/>
+      <w14:ligatures w14:val="none"/>
+    </w:rPr>
+  </w:style>
+  <w:style w:type="character" w:styleId="Textoennegrita">
+    <w:name w:val="Strong"/>
+    <w:basedOn w:val="Fuentedeprrafopredeter"/>
+    <w:uiPriority w:val="22"/>
+    <w:qFormat/>
+    <w:rsid w:val="001A7DDD"/>
+    <w:rPr>
+      <w:b/>
+      <w:bCs/>
+    </w:rPr>
+  </w:style>
+  <w:style w:type="character" w:customStyle="1" w:styleId="Ttulo5Car">
+    <w:name w:val="Título 5 Car"/>
+    <w:basedOn w:val="Fuentedeprrafopredeter"/>
+    <w:link w:val="Ttulo5"/>
+    <w:uiPriority w:val="9"/>
+    <w:semiHidden/>
+    <w:rsid w:val="00344598"/>
+    <w:rPr>
+      <w:rFonts w:asciiTheme="majorHAnsi" w:eastAsiaTheme="majorEastAsia" w:hAnsiTheme="majorHAnsi" w:cstheme="majorBidi"/>
+      <w:color w:val="0F4761" w:themeColor="accent1" w:themeShade="BF"/>
+      <w:sz w:val="21"/>
+    </w:rPr>
   </w:style>
 </w:styles>
 </file>

</xml_diff>

<commit_message>
Entrega final del TP
</commit_message>
<xml_diff>
--- a/TP 2/BigData_TP2_Grupo#4 .docx
+++ b/TP 2/BigData_TP2_Grupo#4 .docx
@@ -32,7 +32,7 @@
                     <pic:cNvPicPr/>
                   </pic:nvPicPr>
                   <pic:blipFill>
-                    <a:blip r:embed="rId7"/>
+                    <a:blip r:embed="rId8"/>
                     <a:stretch>
                       <a:fillRect/>
                     </a:stretch>
@@ -365,6 +365,32 @@
     </w:p>
     <w:p>
       <w:pPr>
+        <w:pBdr>
+          <w:top w:val="nil"/>
+          <w:left w:val="nil"/>
+          <w:bottom w:val="nil"/>
+          <w:right w:val="nil"/>
+          <w:between w:val="nil"/>
+        </w:pBdr>
+        <w:spacing w:before="240" w:after="0" w:line="240" w:lineRule="auto"/>
+        <w:ind w:left="502" w:firstLine="0"/>
+        <w:jc w:val="both"/>
+        <w:rPr>
+          <w:rFonts w:ascii="Century Schoolbook" w:eastAsia="Century Schoolbook" w:hAnsi="Century Schoolbook" w:cs="Century Schoolbook"/>
+          <w:lang w:val="es-US"/>
+        </w:rPr>
+      </w:pPr>
+      <w:r>
+        <w:rPr>
+          <w:rFonts w:ascii="Century Schoolbook" w:eastAsia="Century Schoolbook" w:hAnsi="Century Schoolbook" w:cs="Century Schoolbook"/>
+          <w:lang w:val="es-US"/>
+        </w:rPr>
+        <w:lastRenderedPageBreak/>
+        <w:t>https://github.com/Datso653/BigDataUBA-Grupo-4/tree/main/TP%202</w:t>
+      </w:r>
+    </w:p>
+    <w:p>
+      <w:pPr>
         <w:pStyle w:val="Ttulo1"/>
         <w:rPr>
           <w:rFonts w:ascii="Century Schoolbook" w:eastAsia="Century Schoolbook" w:hAnsi="Century Schoolbook" w:cs="Century Schoolbook"/>
@@ -372,13 +398,22 @@
           <w:lang w:val="es-US"/>
         </w:rPr>
       </w:pPr>
-      <w:r>
+    </w:p>
+    <w:p>
+      <w:pPr>
+        <w:pStyle w:val="Ttulo1"/>
         <w:rPr>
           <w:rFonts w:ascii="Century Schoolbook" w:eastAsia="Century Schoolbook" w:hAnsi="Century Schoolbook" w:cs="Century Schoolbook"/>
           <w:color w:val="002060"/>
           <w:lang w:val="es-US"/>
         </w:rPr>
-        <w:lastRenderedPageBreak/>
+      </w:pPr>
+      <w:r>
+        <w:rPr>
+          <w:rFonts w:ascii="Century Schoolbook" w:eastAsia="Century Schoolbook" w:hAnsi="Century Schoolbook" w:cs="Century Schoolbook"/>
+          <w:color w:val="002060"/>
+          <w:lang w:val="es-US"/>
+        </w:rPr>
         <w:t xml:space="preserve">Parte I: </w:t>
       </w:r>
       <w:r>
@@ -930,7 +965,15 @@
           <w:rFonts w:ascii="Century Schoolbook" w:eastAsia="Century Schoolbook" w:hAnsi="Century Schoolbook" w:cs="Century Schoolbook"/>
           <w:lang w:val="es-US"/>
         </w:rPr>
-        <w:t xml:space="preserve"> la cantidad de valores faltantes para cada año (NA, o </w:t>
+        <w:t xml:space="preserve"> la cantidad de valores faltantes para cada </w:t>
+      </w:r>
+      <w:r>
+        <w:rPr>
+          <w:rFonts w:ascii="Century Schoolbook" w:eastAsia="Century Schoolbook" w:hAnsi="Century Schoolbook" w:cs="Century Schoolbook"/>
+          <w:lang w:val="es-US"/>
+        </w:rPr>
+        <w:lastRenderedPageBreak/>
+        <w:t xml:space="preserve">año (NA, o </w:t>
       </w:r>
       <w:proofErr w:type="spellStart"/>
       <w:r>
@@ -970,7 +1013,6 @@
           <w:rFonts w:ascii="Century Schoolbook" w:eastAsia="Century Schoolbook" w:hAnsi="Century Schoolbook" w:cs="Century Schoolbook"/>
           <w:lang w:val="es-US"/>
         </w:rPr>
-        <w:lastRenderedPageBreak/>
         <w:t>-</w:t>
       </w:r>
       <w:r>
@@ -1001,7 +1043,7 @@
                     <pic:cNvPicPr/>
                   </pic:nvPicPr>
                   <pic:blipFill>
-                    <a:blip r:embed="rId8"/>
+                    <a:blip r:embed="rId9"/>
                     <a:stretch>
                       <a:fillRect/>
                     </a:stretch>
@@ -1213,6 +1255,7 @@
           <w:rFonts w:ascii="Century Schoolbook" w:eastAsia="Century Schoolbook" w:hAnsi="Century Schoolbook" w:cs="Century Schoolbook"/>
           <w:lang w:val="es-US"/>
         </w:rPr>
+        <w:lastRenderedPageBreak/>
         <w:t xml:space="preserve">2d) </w:t>
       </w:r>
       <w:r>
@@ -1292,15 +1335,7 @@
           <w:rFonts w:ascii="Century Schoolbook" w:eastAsia="Century Schoolbook" w:hAnsi="Century Schoolbook" w:cs="Century Schoolbook"/>
           <w:lang w:val="es-US"/>
         </w:rPr>
-        <w:t xml:space="preserve">. </w:t>
-      </w:r>
-      <w:r>
-        <w:rPr>
-          <w:rFonts w:ascii="Century Schoolbook" w:eastAsia="Century Schoolbook" w:hAnsi="Century Schoolbook" w:cs="Century Schoolbook"/>
-          <w:lang w:val="es-US"/>
-        </w:rPr>
-        <w:lastRenderedPageBreak/>
-        <w:t xml:space="preserve">Pruebe, unir la base de datos Individuales con Hogares usando CODUSU y NRO_HOGAR, usando </w:t>
+        <w:t xml:space="preserve">. Pruebe, unir la base de datos Individuales con Hogares usando CODUSU y NRO_HOGAR, usando </w:t>
       </w:r>
       <w:r>
         <w:rPr>
@@ -2186,9 +2221,93 @@
       <w:r>
         <w:rPr>
           <w:rFonts w:ascii="Century Schoolbook" w:eastAsia="Century Schoolbook" w:hAnsi="Century Schoolbook" w:cs="Century Schoolbook"/>
-          <w:lang w:val="es-US"/>
-        </w:rPr>
-        <w:t xml:space="preserve">Realicen un gráfico de barras mostrando la composición por sexo para 2005 y 2025 en su región. </w:t>
+          <w:noProof/>
+        </w:rPr>
+        <w:drawing>
+          <wp:anchor distT="0" distB="0" distL="114300" distR="114300" simplePos="0" relativeHeight="251662336" behindDoc="0" locked="0" layoutInCell="1" allowOverlap="1" wp14:anchorId="591FD4C5" wp14:editId="7EFBF6FD">
+            <wp:simplePos x="0" y="0"/>
+            <wp:positionH relativeFrom="margin">
+              <wp:posOffset>959485</wp:posOffset>
+            </wp:positionH>
+            <wp:positionV relativeFrom="paragraph">
+              <wp:posOffset>733425</wp:posOffset>
+            </wp:positionV>
+            <wp:extent cx="3993515" cy="2476500"/>
+            <wp:effectExtent l="0" t="0" r="6985" b="0"/>
+            <wp:wrapThrough wrapText="bothSides">
+              <wp:wrapPolygon edited="0">
+                <wp:start x="0" y="0"/>
+                <wp:lineTo x="0" y="21434"/>
+                <wp:lineTo x="21535" y="21434"/>
+                <wp:lineTo x="21535" y="0"/>
+                <wp:lineTo x="0" y="0"/>
+              </wp:wrapPolygon>
+            </wp:wrapThrough>
+            <wp:docPr id="6" name="Imagen 6"/>
+            <wp:cNvGraphicFramePr>
+              <a:graphicFrameLocks xmlns:a="http://schemas.openxmlformats.org/drawingml/2006/main" noChangeAspect="1"/>
+            </wp:cNvGraphicFramePr>
+            <a:graphic xmlns:a="http://schemas.openxmlformats.org/drawingml/2006/main">
+              <a:graphicData uri="http://schemas.openxmlformats.org/drawingml/2006/picture">
+                <pic:pic xmlns:pic="http://schemas.openxmlformats.org/drawingml/2006/picture">
+                  <pic:nvPicPr>
+                    <pic:cNvPr id="0" name="Picture 1"/>
+                    <pic:cNvPicPr>
+                      <a:picLocks noChangeAspect="1" noChangeArrowheads="1"/>
+                    </pic:cNvPicPr>
+                  </pic:nvPicPr>
+                  <pic:blipFill>
+                    <a:blip r:embed="rId10">
+                      <a:extLst>
+                        <a:ext uri="{28A0092B-C50C-407E-A947-70E740481C1C}">
+                          <a14:useLocalDpi xmlns:a14="http://schemas.microsoft.com/office/drawing/2010/main" val="0"/>
+                        </a:ext>
+                      </a:extLst>
+                    </a:blip>
+                    <a:srcRect/>
+                    <a:stretch>
+                      <a:fillRect/>
+                    </a:stretch>
+                  </pic:blipFill>
+                  <pic:spPr bwMode="auto">
+                    <a:xfrm>
+                      <a:off x="0" y="0"/>
+                      <a:ext cx="3993515" cy="2476500"/>
+                    </a:xfrm>
+                    <a:prstGeom prst="rect">
+                      <a:avLst/>
+                    </a:prstGeom>
+                    <a:noFill/>
+                    <a:ln>
+                      <a:noFill/>
+                    </a:ln>
+                  </pic:spPr>
+                </pic:pic>
+              </a:graphicData>
+            </a:graphic>
+            <wp14:sizeRelH relativeFrom="margin">
+              <wp14:pctWidth>0</wp14:pctWidth>
+            </wp14:sizeRelH>
+            <wp14:sizeRelV relativeFrom="margin">
+              <wp14:pctHeight>0</wp14:pctHeight>
+            </wp14:sizeRelV>
+          </wp:anchor>
+        </w:drawing>
+      </w:r>
+      <w:r>
+        <w:rPr>
+          <w:rFonts w:ascii="Century Schoolbook" w:eastAsia="Century Schoolbook" w:hAnsi="Century Schoolbook" w:cs="Century Schoolbook"/>
+          <w:lang w:val="es-US"/>
+        </w:rPr>
+        <w:t xml:space="preserve">Realicen un gráfico de barras mostrando la composición por sexo para 2005 y 2025 en su </w:t>
+      </w:r>
+      <w:r>
+        <w:rPr>
+          <w:rFonts w:ascii="Century Schoolbook" w:eastAsia="Century Schoolbook" w:hAnsi="Century Schoolbook" w:cs="Century Schoolbook"/>
+          <w:lang w:val="es-US"/>
+        </w:rPr>
+        <w:lastRenderedPageBreak/>
+        <w:t xml:space="preserve">región. </w:t>
       </w:r>
       <w:r>
         <w:rPr>
@@ -2196,6 +2315,119 @@
         </w:rPr>
         <w:t>Comenten los resultados.</w:t>
       </w:r>
+    </w:p>
+    <w:p>
+      <w:pPr>
+        <w:pBdr>
+          <w:top w:val="nil"/>
+          <w:left w:val="nil"/>
+          <w:bottom w:val="nil"/>
+          <w:right w:val="nil"/>
+          <w:between w:val="nil"/>
+        </w:pBdr>
+        <w:spacing w:before="240" w:after="0" w:line="240" w:lineRule="auto"/>
+        <w:ind w:left="1080" w:firstLine="0"/>
+        <w:jc w:val="both"/>
+        <w:rPr>
+          <w:rFonts w:ascii="Century Schoolbook" w:eastAsia="Century Schoolbook" w:hAnsi="Century Schoolbook" w:cs="Century Schoolbook"/>
+        </w:rPr>
+      </w:pPr>
+      <w:r>
+        <w:rPr>
+          <w:rFonts w:ascii="Century Schoolbook" w:eastAsia="Century Schoolbook" w:hAnsi="Century Schoolbook" w:cs="Century Schoolbook"/>
+        </w:rPr>
+        <w:t xml:space="preserve">El gráfico muestra que en 2005 las mujeres tenían una presencia algo mayoritaria, con un </w:t>
+      </w:r>
+      <w:r>
+        <w:rPr>
+          <w:rFonts w:ascii="Century Schoolbook" w:eastAsia="Century Schoolbook" w:hAnsi="Century Schoolbook" w:cs="Century Schoolbook"/>
+          <w:b/>
+          <w:bCs/>
+        </w:rPr>
+        <w:t>54,2%</w:t>
+      </w:r>
+      <w:r>
+        <w:rPr>
+          <w:rFonts w:ascii="Century Schoolbook" w:eastAsia="Century Schoolbook" w:hAnsi="Century Schoolbook" w:cs="Century Schoolbook"/>
+        </w:rPr>
+        <w:t xml:space="preserve"> frente al </w:t>
+      </w:r>
+      <w:r>
+        <w:rPr>
+          <w:rFonts w:ascii="Century Schoolbook" w:eastAsia="Century Schoolbook" w:hAnsi="Century Schoolbook" w:cs="Century Schoolbook"/>
+          <w:b/>
+          <w:bCs/>
+        </w:rPr>
+        <w:t>45,8%</w:t>
+      </w:r>
+      <w:r>
+        <w:rPr>
+          <w:rFonts w:ascii="Century Schoolbook" w:eastAsia="Century Schoolbook" w:hAnsi="Century Schoolbook" w:cs="Century Schoolbook"/>
+        </w:rPr>
+        <w:t xml:space="preserve"> de los varones. En 2025 la brecha se achica: las mujeres bajan al </w:t>
+      </w:r>
+      <w:r>
+        <w:rPr>
+          <w:rFonts w:ascii="Century Schoolbook" w:eastAsia="Century Schoolbook" w:hAnsi="Century Schoolbook" w:cs="Century Schoolbook"/>
+          <w:b/>
+          <w:bCs/>
+        </w:rPr>
+        <w:t>53,2%</w:t>
+      </w:r>
+      <w:r>
+        <w:rPr>
+          <w:rFonts w:ascii="Century Schoolbook" w:eastAsia="Century Schoolbook" w:hAnsi="Century Schoolbook" w:cs="Century Schoolbook"/>
+        </w:rPr>
+        <w:t xml:space="preserve">, mientras que los varones suben al </w:t>
+      </w:r>
+      <w:r>
+        <w:rPr>
+          <w:rFonts w:ascii="Century Schoolbook" w:eastAsia="Century Schoolbook" w:hAnsi="Century Schoolbook" w:cs="Century Schoolbook"/>
+          <w:b/>
+          <w:bCs/>
+        </w:rPr>
+        <w:t>46,8%</w:t>
+      </w:r>
+      <w:r>
+        <w:rPr>
+          <w:rFonts w:ascii="Century Schoolbook" w:eastAsia="Century Schoolbook" w:hAnsi="Century Schoolbook" w:cs="Century Schoolbook"/>
+        </w:rPr>
+        <w:t>. En conjunto, la composición por sexo se mantiene bastante equilibrada, aunque con una leve reducción del peso femenino y un aumento correspondiente de los varones.</w:t>
+      </w:r>
+    </w:p>
+    <w:p>
+      <w:pPr>
+        <w:pBdr>
+          <w:top w:val="nil"/>
+          <w:left w:val="nil"/>
+          <w:bottom w:val="nil"/>
+          <w:right w:val="nil"/>
+          <w:between w:val="nil"/>
+        </w:pBdr>
+        <w:spacing w:before="240" w:after="0" w:line="240" w:lineRule="auto"/>
+        <w:ind w:left="502" w:firstLine="0"/>
+        <w:jc w:val="both"/>
+        <w:rPr>
+          <w:rFonts w:ascii="Century Schoolbook" w:eastAsia="Century Schoolbook" w:hAnsi="Century Schoolbook" w:cs="Century Schoolbook"/>
+        </w:rPr>
+      </w:pPr>
+    </w:p>
+    <w:p>
+      <w:pPr>
+        <w:pBdr>
+          <w:top w:val="nil"/>
+          <w:left w:val="nil"/>
+          <w:bottom w:val="nil"/>
+          <w:right w:val="nil"/>
+          <w:between w:val="nil"/>
+        </w:pBdr>
+        <w:spacing w:before="240" w:after="0" w:line="240" w:lineRule="auto"/>
+        <w:ind w:left="502" w:firstLine="0"/>
+        <w:jc w:val="both"/>
+        <w:rPr>
+          <w:rFonts w:ascii="Century Schoolbook" w:eastAsia="Century Schoolbook" w:hAnsi="Century Schoolbook" w:cs="Century Schoolbook"/>
+        </w:rPr>
+      </w:pPr>
     </w:p>
     <w:p>
       <w:pPr>
@@ -2219,6 +2451,74 @@
       <w:r>
         <w:rPr>
           <w:rFonts w:ascii="Century Schoolbook" w:eastAsia="Century Schoolbook" w:hAnsi="Century Schoolbook" w:cs="Century Schoolbook"/>
+          <w:noProof/>
+        </w:rPr>
+        <w:drawing>
+          <wp:anchor distT="0" distB="0" distL="114300" distR="114300" simplePos="0" relativeHeight="251663360" behindDoc="0" locked="0" layoutInCell="1" allowOverlap="1" wp14:anchorId="2E2550D2" wp14:editId="7B977447">
+            <wp:simplePos x="0" y="0"/>
+            <wp:positionH relativeFrom="page">
+              <wp:align>center</wp:align>
+            </wp:positionH>
+            <wp:positionV relativeFrom="paragraph">
+              <wp:posOffset>1279525</wp:posOffset>
+            </wp:positionV>
+            <wp:extent cx="3505200" cy="3165475"/>
+            <wp:effectExtent l="0" t="0" r="0" b="0"/>
+            <wp:wrapTopAndBottom/>
+            <wp:docPr id="7" name="Imagen 7"/>
+            <wp:cNvGraphicFramePr>
+              <a:graphicFrameLocks xmlns:a="http://schemas.openxmlformats.org/drawingml/2006/main" noChangeAspect="1"/>
+            </wp:cNvGraphicFramePr>
+            <a:graphic xmlns:a="http://schemas.openxmlformats.org/drawingml/2006/main">
+              <a:graphicData uri="http://schemas.openxmlformats.org/drawingml/2006/picture">
+                <pic:pic xmlns:pic="http://schemas.openxmlformats.org/drawingml/2006/picture">
+                  <pic:nvPicPr>
+                    <pic:cNvPr id="0" name="Picture 3"/>
+                    <pic:cNvPicPr>
+                      <a:picLocks noChangeAspect="1" noChangeArrowheads="1"/>
+                    </pic:cNvPicPr>
+                  </pic:nvPicPr>
+                  <pic:blipFill>
+                    <a:blip r:embed="rId11" cstate="print">
+                      <a:extLst>
+                        <a:ext uri="{28A0092B-C50C-407E-A947-70E740481C1C}">
+                          <a14:useLocalDpi xmlns:a14="http://schemas.microsoft.com/office/drawing/2010/main" val="0"/>
+                        </a:ext>
+                      </a:extLst>
+                    </a:blip>
+                    <a:srcRect/>
+                    <a:stretch>
+                      <a:fillRect/>
+                    </a:stretch>
+                  </pic:blipFill>
+                  <pic:spPr bwMode="auto">
+                    <a:xfrm>
+                      <a:off x="0" y="0"/>
+                      <a:ext cx="3505200" cy="3165475"/>
+                    </a:xfrm>
+                    <a:prstGeom prst="rect">
+                      <a:avLst/>
+                    </a:prstGeom>
+                    <a:noFill/>
+                    <a:ln>
+                      <a:noFill/>
+                    </a:ln>
+                  </pic:spPr>
+                </pic:pic>
+              </a:graphicData>
+            </a:graphic>
+            <wp14:sizeRelH relativeFrom="margin">
+              <wp14:pctWidth>0</wp14:pctWidth>
+            </wp14:sizeRelH>
+            <wp14:sizeRelV relativeFrom="margin">
+              <wp14:pctHeight>0</wp14:pctHeight>
+            </wp14:sizeRelV>
+          </wp:anchor>
+        </w:drawing>
+      </w:r>
+      <w:r>
+        <w:rPr>
+          <w:rFonts w:ascii="Century Schoolbook" w:eastAsia="Century Schoolbook" w:hAnsi="Century Schoolbook" w:cs="Century Schoolbook"/>
           <w:lang w:val="es-US"/>
         </w:rPr>
         <w:t xml:space="preserve">Realicen una matriz de correlación para 2005 y 2025 con las siguientes variables: </w:t>
@@ -2253,7 +2553,7 @@
         </w:rPr>
         <w:t xml:space="preserve">) y renombrar dichas variables para que las etiquetas tengan sentido en el gráfico de correlación. Utilicen alguno de los comandos disponibles en este </w:t>
       </w:r>
-      <w:hyperlink r:id="rId9">
+      <w:hyperlink r:id="rId12">
         <w:r>
           <w:rPr>
             <w:rFonts w:ascii="Century Schoolbook" w:eastAsia="Century Schoolbook" w:hAnsi="Century Schoolbook" w:cs="Century Schoolbook"/>
@@ -2287,6 +2587,517 @@
     </w:p>
     <w:p>
       <w:pPr>
+        <w:pStyle w:val="NormalWeb"/>
+      </w:pPr>
+      <w:r>
+        <w:t>La matriz de correlación para el año 2005 muestra cómo se relacionan entre sí las distintas variables de la base.</w:t>
+      </w:r>
+    </w:p>
+    <w:p>
+      <w:pPr>
+        <w:pStyle w:val="NormalWeb"/>
+      </w:pPr>
+      <w:r>
+        <w:t>Algunos puntos destacados:</w:t>
+      </w:r>
+    </w:p>
+    <w:p>
+      <w:pPr>
+        <w:pStyle w:val="NormalWeb"/>
+        <w:numPr>
+          <w:ilvl w:val="0"/>
+          <w:numId w:val="10"/>
+        </w:numPr>
+      </w:pPr>
+      <w:r>
+        <w:t>En la diagonal los valores son</w:t>
+      </w:r>
+      <w:r>
+        <w:t xml:space="preserve"> 1</w:t>
+      </w:r>
+      <w:r>
+        <w:t>, porque cada variable está perfectamente correlacionada consigo misma.</w:t>
+      </w:r>
+    </w:p>
+    <w:p>
+      <w:pPr>
+        <w:pStyle w:val="NormalWeb"/>
+        <w:numPr>
+          <w:ilvl w:val="0"/>
+          <w:numId w:val="10"/>
+        </w:numPr>
+      </w:pPr>
+      <w:r>
+        <w:lastRenderedPageBreak/>
+        <w:t xml:space="preserve">Las variables de </w:t>
+      </w:r>
+      <w:r>
+        <w:rPr>
+          <w:rStyle w:val="Textoennegrita"/>
+          <w:b w:val="0"/>
+          <w:bCs w:val="0"/>
+        </w:rPr>
+        <w:t>sexo</w:t>
+      </w:r>
+      <w:r>
+        <w:t xml:space="preserve"> (Mujer y Varón) están fuertemente correlacionadas de forma negativa, lo que refleja que son categorías excluyentes.</w:t>
+      </w:r>
+    </w:p>
+    <w:p>
+      <w:pPr>
+        <w:pStyle w:val="NormalWeb"/>
+        <w:numPr>
+          <w:ilvl w:val="0"/>
+          <w:numId w:val="10"/>
+        </w:numPr>
+      </w:pPr>
+      <w:r>
+        <w:t>Los distintos niveles educativos también muestran correlaciones negativas entre sí, por la misma razón: representan categorías mutuamente excluyentes.</w:t>
+      </w:r>
+    </w:p>
+    <w:p>
+      <w:pPr>
+        <w:pStyle w:val="NormalWeb"/>
+        <w:numPr>
+          <w:ilvl w:val="0"/>
+          <w:numId w:val="10"/>
+        </w:numPr>
+      </w:pPr>
+      <w:r>
+        <w:t xml:space="preserve">Algo similar ocurre con las categorías de </w:t>
+      </w:r>
+      <w:r>
+        <w:rPr>
+          <w:rStyle w:val="Textoennegrita"/>
+          <w:b w:val="0"/>
+          <w:bCs w:val="0"/>
+        </w:rPr>
+        <w:t>estado</w:t>
+      </w:r>
+      <w:r>
+        <w:rPr>
+          <w:rStyle w:val="Textoennegrita"/>
+        </w:rPr>
+        <w:t xml:space="preserve"> </w:t>
+      </w:r>
+      <w:r>
+        <w:rPr>
+          <w:rStyle w:val="Textoennegrita"/>
+          <w:b w:val="0"/>
+          <w:bCs w:val="0"/>
+        </w:rPr>
+        <w:t>laboral</w:t>
+      </w:r>
+      <w:r>
+        <w:t xml:space="preserve"> y de </w:t>
+      </w:r>
+      <w:r>
+        <w:rPr>
+          <w:rStyle w:val="Textoennegrita"/>
+          <w:b w:val="0"/>
+          <w:bCs w:val="0"/>
+        </w:rPr>
+        <w:t>condición</w:t>
+      </w:r>
+      <w:r>
+        <w:rPr>
+          <w:rStyle w:val="Textoennegrita"/>
+        </w:rPr>
+        <w:t xml:space="preserve"> de </w:t>
+      </w:r>
+      <w:r>
+        <w:rPr>
+          <w:rStyle w:val="Textoennegrita"/>
+          <w:b w:val="0"/>
+          <w:bCs w:val="0"/>
+        </w:rPr>
+        <w:t>inactividad</w:t>
+      </w:r>
+      <w:r>
+        <w:t>: presentan correlaciones altas negativas, ya que una persona solo puede pertenecer a una de ellas.</w:t>
+      </w:r>
+    </w:p>
+    <w:p>
+      <w:pPr>
+        <w:pStyle w:val="NormalWeb"/>
+        <w:numPr>
+          <w:ilvl w:val="0"/>
+          <w:numId w:val="10"/>
+        </w:numPr>
+      </w:pPr>
+      <w:r>
+        <w:t>El resto de las correlaciones en general son bajas, lo que sugiere que no hay relaciones lineales fuertes entre las demás variables (como las de ingresos con estado ocupacional o nivel educativo).</w:t>
+      </w:r>
+    </w:p>
+    <w:p>
+      <w:pPr>
+        <w:pStyle w:val="NormalWeb"/>
+      </w:pPr>
+      <w:r>
+        <w:rPr>
+          <w:rFonts w:ascii="Century Schoolbook" w:eastAsia="Century Schoolbook" w:hAnsi="Century Schoolbook" w:cs="Century Schoolbook"/>
+          <w:noProof/>
+        </w:rPr>
+        <w:drawing>
+          <wp:anchor distT="0" distB="0" distL="114300" distR="114300" simplePos="0" relativeHeight="251664384" behindDoc="0" locked="0" layoutInCell="1" allowOverlap="1" wp14:anchorId="3D098F76" wp14:editId="17D7CEE5">
+            <wp:simplePos x="0" y="0"/>
+            <wp:positionH relativeFrom="margin">
+              <wp:align>center</wp:align>
+            </wp:positionH>
+            <wp:positionV relativeFrom="paragraph">
+              <wp:posOffset>714375</wp:posOffset>
+            </wp:positionV>
+            <wp:extent cx="3095625" cy="2795270"/>
+            <wp:effectExtent l="0" t="0" r="9525" b="5080"/>
+            <wp:wrapTopAndBottom/>
+            <wp:docPr id="10" name="Imagen 10"/>
+            <wp:cNvGraphicFramePr>
+              <a:graphicFrameLocks xmlns:a="http://schemas.openxmlformats.org/drawingml/2006/main" noChangeAspect="1"/>
+            </wp:cNvGraphicFramePr>
+            <a:graphic xmlns:a="http://schemas.openxmlformats.org/drawingml/2006/main">
+              <a:graphicData uri="http://schemas.openxmlformats.org/drawingml/2006/picture">
+                <pic:pic xmlns:pic="http://schemas.openxmlformats.org/drawingml/2006/picture">
+                  <pic:nvPicPr>
+                    <pic:cNvPr id="0" name="Picture 2"/>
+                    <pic:cNvPicPr>
+                      <a:picLocks noChangeAspect="1" noChangeArrowheads="1"/>
+                    </pic:cNvPicPr>
+                  </pic:nvPicPr>
+                  <pic:blipFill>
+                    <a:blip r:embed="rId13" cstate="print">
+                      <a:extLst>
+                        <a:ext uri="{28A0092B-C50C-407E-A947-70E740481C1C}">
+                          <a14:useLocalDpi xmlns:a14="http://schemas.microsoft.com/office/drawing/2010/main" val="0"/>
+                        </a:ext>
+                      </a:extLst>
+                    </a:blip>
+                    <a:srcRect/>
+                    <a:stretch>
+                      <a:fillRect/>
+                    </a:stretch>
+                  </pic:blipFill>
+                  <pic:spPr bwMode="auto">
+                    <a:xfrm>
+                      <a:off x="0" y="0"/>
+                      <a:ext cx="3095625" cy="2795270"/>
+                    </a:xfrm>
+                    <a:prstGeom prst="rect">
+                      <a:avLst/>
+                    </a:prstGeom>
+                    <a:noFill/>
+                  </pic:spPr>
+                </pic:pic>
+              </a:graphicData>
+            </a:graphic>
+            <wp14:sizeRelH relativeFrom="margin">
+              <wp14:pctWidth>0</wp14:pctWidth>
+            </wp14:sizeRelH>
+            <wp14:sizeRelV relativeFrom="margin">
+              <wp14:pctHeight>0</wp14:pctHeight>
+            </wp14:sizeRelV>
+          </wp:anchor>
+        </w:drawing>
+      </w:r>
+      <w:r>
+        <w:t xml:space="preserve">En conjunto, la matriz confirma que las variables categóricas transformadas en </w:t>
+      </w:r>
+      <w:proofErr w:type="spellStart"/>
+      <w:r>
+        <w:t>dummies</w:t>
+      </w:r>
+      <w:proofErr w:type="spellEnd"/>
+      <w:r>
+        <w:t xml:space="preserve"> se relacionan fuertemente entre sí por exclusión, mientras que las variables continuas o de conteo mantienen relaciones más débiles.</w:t>
+      </w:r>
+    </w:p>
+    <w:p>
+      <w:pPr>
+        <w:spacing w:before="100" w:beforeAutospacing="1" w:after="100" w:afterAutospacing="1" w:line="240" w:lineRule="auto"/>
+        <w:ind w:left="0" w:firstLine="0"/>
+        <w:rPr>
+          <w:rFonts w:ascii="Times New Roman" w:eastAsia="Times New Roman" w:hAnsi="Times New Roman" w:cs="Times New Roman"/>
+          <w:color w:val="auto"/>
+          <w:kern w:val="0"/>
+          <w:sz w:val="24"/>
+          <w:lang w:val="es-AR" w:eastAsia="es-AR"/>
+          <w14:ligatures w14:val="none"/>
+        </w:rPr>
+      </w:pPr>
+      <w:r>
+        <w:rPr>
+          <w:rFonts w:ascii="Times New Roman" w:eastAsia="Times New Roman" w:hAnsi="Times New Roman" w:cs="Times New Roman"/>
+          <w:color w:val="auto"/>
+          <w:kern w:val="0"/>
+          <w:sz w:val="24"/>
+          <w:lang w:val="es-AR" w:eastAsia="es-AR"/>
+          <w14:ligatures w14:val="none"/>
+        </w:rPr>
+        <w:t>La matriz de correlación de 2025 mantiene un patrón muy parecido al de 2005.</w:t>
+      </w:r>
+    </w:p>
+    <w:p>
+      <w:pPr>
+        <w:numPr>
+          <w:ilvl w:val="0"/>
+          <w:numId w:val="11"/>
+        </w:numPr>
+        <w:spacing w:before="100" w:beforeAutospacing="1" w:after="100" w:afterAutospacing="1" w:line="240" w:lineRule="auto"/>
+        <w:rPr>
+          <w:rFonts w:ascii="Times New Roman" w:eastAsia="Times New Roman" w:hAnsi="Times New Roman" w:cs="Times New Roman"/>
+          <w:color w:val="auto"/>
+          <w:kern w:val="0"/>
+          <w:sz w:val="24"/>
+          <w:lang w:val="es-AR" w:eastAsia="es-AR"/>
+          <w14:ligatures w14:val="none"/>
+        </w:rPr>
+      </w:pPr>
+      <w:r>
+        <w:rPr>
+          <w:rFonts w:ascii="Times New Roman" w:eastAsia="Times New Roman" w:hAnsi="Times New Roman" w:cs="Times New Roman"/>
+          <w:color w:val="auto"/>
+          <w:kern w:val="0"/>
+          <w:sz w:val="24"/>
+          <w:lang w:val="es-AR" w:eastAsia="es-AR"/>
+          <w14:ligatures w14:val="none"/>
+        </w:rPr>
+        <w:t>Se observan fuertes correlaciones negativas entre categorías mutuamente excluyentes, como sexo (mujer/varón), los niveles educativos y los estados ocupacionales.</w:t>
+      </w:r>
+    </w:p>
+    <w:p>
+      <w:pPr>
+        <w:numPr>
+          <w:ilvl w:val="0"/>
+          <w:numId w:val="11"/>
+        </w:numPr>
+        <w:spacing w:before="100" w:beforeAutospacing="1" w:after="100" w:afterAutospacing="1" w:line="240" w:lineRule="auto"/>
+        <w:rPr>
+          <w:rFonts w:ascii="Times New Roman" w:eastAsia="Times New Roman" w:hAnsi="Times New Roman" w:cs="Times New Roman"/>
+          <w:color w:val="auto"/>
+          <w:kern w:val="0"/>
+          <w:sz w:val="24"/>
+          <w:lang w:val="es-AR" w:eastAsia="es-AR"/>
+          <w14:ligatures w14:val="none"/>
+        </w:rPr>
+      </w:pPr>
+      <w:r>
+        <w:rPr>
+          <w:rFonts w:ascii="Times New Roman" w:eastAsia="Times New Roman" w:hAnsi="Times New Roman" w:cs="Times New Roman"/>
+          <w:color w:val="auto"/>
+          <w:kern w:val="0"/>
+          <w:sz w:val="24"/>
+          <w:lang w:val="es-AR" w:eastAsia="es-AR"/>
+          <w14:ligatures w14:val="none"/>
+        </w:rPr>
+        <w:t>Entre las variables numéricas (por ejemplo ingresos y componentes del hogar) las correlaciones son más bajas, sin vínculos lineales fuertes.</w:t>
+      </w:r>
+    </w:p>
+    <w:p>
+      <w:pPr>
+        <w:numPr>
+          <w:ilvl w:val="0"/>
+          <w:numId w:val="11"/>
+        </w:numPr>
+        <w:spacing w:before="100" w:beforeAutospacing="1" w:after="100" w:afterAutospacing="1" w:line="240" w:lineRule="auto"/>
+        <w:rPr>
+          <w:rFonts w:ascii="Times New Roman" w:eastAsia="Times New Roman" w:hAnsi="Times New Roman" w:cs="Times New Roman"/>
+          <w:color w:val="auto"/>
+          <w:kern w:val="0"/>
+          <w:sz w:val="24"/>
+          <w:lang w:val="es-AR" w:eastAsia="es-AR"/>
+          <w14:ligatures w14:val="none"/>
+        </w:rPr>
+      </w:pPr>
+      <w:r>
+        <w:rPr>
+          <w:rFonts w:ascii="Times New Roman" w:eastAsia="Times New Roman" w:hAnsi="Times New Roman" w:cs="Times New Roman"/>
+          <w:color w:val="auto"/>
+          <w:kern w:val="0"/>
+          <w:sz w:val="24"/>
+          <w:lang w:val="es-AR" w:eastAsia="es-AR"/>
+          <w14:ligatures w14:val="none"/>
+        </w:rPr>
+        <w:t xml:space="preserve">Al igual que en 2005, la estructura refleja que la mayor parte de las relaciones intensas provienen de la codificación en </w:t>
+      </w:r>
+      <w:proofErr w:type="spellStart"/>
+      <w:r>
+        <w:rPr>
+          <w:rFonts w:ascii="Times New Roman" w:eastAsia="Times New Roman" w:hAnsi="Times New Roman" w:cs="Times New Roman"/>
+          <w:color w:val="auto"/>
+          <w:kern w:val="0"/>
+          <w:sz w:val="24"/>
+          <w:lang w:val="es-AR" w:eastAsia="es-AR"/>
+          <w14:ligatures w14:val="none"/>
+        </w:rPr>
+        <w:t>dummies</w:t>
+      </w:r>
+      <w:proofErr w:type="spellEnd"/>
+      <w:r>
+        <w:rPr>
+          <w:rFonts w:ascii="Times New Roman" w:eastAsia="Times New Roman" w:hAnsi="Times New Roman" w:cs="Times New Roman"/>
+          <w:color w:val="auto"/>
+          <w:kern w:val="0"/>
+          <w:sz w:val="24"/>
+          <w:lang w:val="es-AR" w:eastAsia="es-AR"/>
+          <w14:ligatures w14:val="none"/>
+        </w:rPr>
+        <w:t xml:space="preserve"> de variables categóricas.</w:t>
+      </w:r>
+    </w:p>
+    <w:p>
+      <w:pPr>
+        <w:spacing w:before="100" w:beforeAutospacing="1" w:after="100" w:afterAutospacing="1" w:line="240" w:lineRule="auto"/>
+        <w:ind w:left="0" w:firstLine="0"/>
+        <w:rPr>
+          <w:rFonts w:ascii="Times New Roman" w:eastAsia="Times New Roman" w:hAnsi="Times New Roman" w:cs="Times New Roman"/>
+          <w:color w:val="auto"/>
+          <w:kern w:val="0"/>
+          <w:sz w:val="24"/>
+          <w:lang w:val="es-AR" w:eastAsia="es-AR"/>
+          <w14:ligatures w14:val="none"/>
+        </w:rPr>
+      </w:pPr>
+      <w:r>
+        <w:rPr>
+          <w:rFonts w:ascii="Times New Roman" w:eastAsia="Times New Roman" w:hAnsi="Times New Roman" w:cs="Times New Roman"/>
+          <w:color w:val="auto"/>
+          <w:kern w:val="0"/>
+          <w:sz w:val="24"/>
+          <w:lang w:val="es-AR" w:eastAsia="es-AR"/>
+          <w14:ligatures w14:val="none"/>
+        </w:rPr>
+        <w:t>En síntesis, no hay cambios sustanciales en los patrones de correlación: se repite la lógica de exclusión entre categorías y la baja correlación entre las variables continuas.</w:t>
+      </w:r>
+    </w:p>
+    <w:p>
+      <w:pPr>
+        <w:pStyle w:val="NormalWeb"/>
+      </w:pPr>
+      <w:r>
+        <w:t>Comparando las matrices de 2005 y 2025 se observa un patrón muy similar: las correlaciones fuertes aparecen entre categorías mutuamente excluyentes (sexo, niveles educativos y estados laborales), mientras que las variables numéricas muestran relaciones más débiles. En ambos años la estructura general se mantiene estable, sin cambios sustanciales en la forma en que las variables se relacionan entre sí.</w:t>
+      </w:r>
+    </w:p>
+    <w:p>
+      <w:pPr>
+        <w:spacing w:before="100" w:beforeAutospacing="1" w:after="100" w:afterAutospacing="1" w:line="240" w:lineRule="auto"/>
+        <w:ind w:left="0" w:firstLine="0"/>
+        <w:rPr>
+          <w:rFonts w:ascii="Times New Roman" w:eastAsia="Times New Roman" w:hAnsi="Times New Roman" w:cs="Times New Roman"/>
+          <w:color w:val="auto"/>
+          <w:kern w:val="0"/>
+          <w:sz w:val="24"/>
+          <w:lang w:val="es-AR" w:eastAsia="es-AR"/>
+          <w14:ligatures w14:val="none"/>
+        </w:rPr>
+      </w:pPr>
+    </w:p>
+    <w:p>
+      <w:pPr>
+        <w:pBdr>
+          <w:top w:val="nil"/>
+          <w:left w:val="nil"/>
+          <w:bottom w:val="nil"/>
+          <w:right w:val="nil"/>
+          <w:between w:val="nil"/>
+        </w:pBdr>
+        <w:spacing w:before="240" w:after="0" w:line="240" w:lineRule="auto"/>
+        <w:ind w:left="502" w:firstLine="0"/>
+        <w:jc w:val="both"/>
+        <w:rPr>
+          <w:rFonts w:ascii="Century Schoolbook" w:eastAsia="Century Schoolbook" w:hAnsi="Century Schoolbook" w:cs="Century Schoolbook"/>
+          <w:lang w:val="es-AR"/>
+        </w:rPr>
+      </w:pPr>
+      <w:r>
+        <w:rPr>
+          <w:noProof/>
+        </w:rPr>
+        <mc:AlternateContent>
+          <mc:Choice Requires="wps">
+            <w:drawing>
+              <wp:inline distT="0" distB="0" distL="0" distR="0" wp14:anchorId="2A48B0E8" wp14:editId="0F6D9473">
+                <wp:extent cx="304800" cy="304800"/>
+                <wp:effectExtent l="0" t="0" r="0" b="0"/>
+                <wp:docPr id="8" name="Rectángulo 8" descr="Uploaded image"/>
+                <wp:cNvGraphicFramePr>
+                  <a:graphicFrameLocks xmlns:a="http://schemas.openxmlformats.org/drawingml/2006/main" noChangeAspect="1"/>
+                </wp:cNvGraphicFramePr>
+                <a:graphic xmlns:a="http://schemas.openxmlformats.org/drawingml/2006/main">
+                  <a:graphicData uri="http://schemas.microsoft.com/office/word/2010/wordprocessingShape">
+                    <wps:wsp>
+                      <wps:cNvSpPr>
+                        <a:spLocks noChangeAspect="1" noChangeArrowheads="1"/>
+                      </wps:cNvSpPr>
+                      <wps:spPr bwMode="auto">
+                        <a:xfrm>
+                          <a:off x="0" y="0"/>
+                          <a:ext cx="304800" cy="304800"/>
+                        </a:xfrm>
+                        <a:prstGeom prst="rect">
+                          <a:avLst/>
+                        </a:prstGeom>
+                        <a:noFill/>
+                        <a:ln>
+                          <a:noFill/>
+                        </a:ln>
+                        <a:extLst>
+                          <a:ext uri="{909E8E84-426E-40DD-AFC4-6F175D3DCCD1}">
+                            <a14:hiddenFill xmlns:a14="http://schemas.microsoft.com/office/drawing/2010/main">
+                              <a:solidFill>
+                                <a:srgbClr val="FFFFFF"/>
+                              </a:solidFill>
+                            </a14:hiddenFill>
+                          </a:ext>
+                          <a:ext uri="{91240B29-F687-4F45-9708-019B960494DF}">
+                            <a14:hiddenLine xmlns:a14="http://schemas.microsoft.com/office/drawing/2010/main" w="9525">
+                              <a:solidFill>
+                                <a:srgbClr val="000000"/>
+                              </a:solidFill>
+                              <a:miter lim="800000"/>
+                              <a:headEnd/>
+                              <a:tailEnd/>
+                            </a14:hiddenLine>
+                          </a:ext>
+                        </a:extLst>
+                      </wps:spPr>
+                      <wps:bodyPr rot="0" vert="horz" wrap="square" lIns="91440" tIns="45720" rIns="91440" bIns="45720" anchor="t" anchorCtr="0" upright="1">
+                        <a:noAutofit/>
+                      </wps:bodyPr>
+                    </wps:wsp>
+                  </a:graphicData>
+                </a:graphic>
+              </wp:inline>
+            </w:drawing>
+          </mc:Choice>
+          <mc:Fallback>
+            <w:pict>
+              <v:rect w14:anchorId="39B7CE24" id="Rectángulo 8" o:spid="_x0000_s1026" alt="Uploaded image" style="width:24pt;height:24pt;visibility:visible;mso-wrap-style:square;mso-left-percent:-10001;mso-top-percent:-10001;mso-position-horizontal:absolute;mso-position-horizontal-relative:char;mso-position-vertical:absolute;mso-position-vertical-relative:line;mso-left-percent:-10001;mso-top-percent:-10001;v-text-anchor:top" o:gfxdata="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" filled="f" stroked="f">
+                <o:lock v:ext="edit" aspectratio="t"/>
+                <w10:anchorlock/>
+              </v:rect>
+            </w:pict>
+          </mc:Fallback>
+        </mc:AlternateContent>
+      </w:r>
+    </w:p>
+    <w:p>
+      <w:pPr>
+        <w:pBdr>
+          <w:top w:val="nil"/>
+          <w:left w:val="nil"/>
+          <w:bottom w:val="nil"/>
+          <w:right w:val="nil"/>
+          <w:between w:val="nil"/>
+        </w:pBdr>
+        <w:spacing w:before="240" w:after="0" w:line="240" w:lineRule="auto"/>
+        <w:ind w:left="502" w:firstLine="0"/>
+        <w:jc w:val="both"/>
+        <w:rPr>
+          <w:rFonts w:ascii="Century Schoolbook" w:eastAsia="Century Schoolbook" w:hAnsi="Century Schoolbook" w:cs="Century Schoolbook"/>
+        </w:rPr>
+      </w:pPr>
+    </w:p>
+    <w:p>
+      <w:pPr>
         <w:pStyle w:val="Ttulo1"/>
         <w:rPr>
           <w:rFonts w:ascii="Century Schoolbook" w:eastAsia="Century Schoolbook" w:hAnsi="Century Schoolbook" w:cs="Century Schoolbook"/>
@@ -2325,7 +3136,6 @@
           <w:rFonts w:ascii="Century Schoolbook" w:eastAsia="Century Schoolbook" w:hAnsi="Century Schoolbook" w:cs="Century Schoolbook"/>
           <w:lang w:val="es-US"/>
         </w:rPr>
-        <w:lastRenderedPageBreak/>
         <w:t>Los siguientes incisos apuntan a ver los resultados para su región seleccionada y comparando 2005 con 2025.</w:t>
       </w:r>
     </w:p>
@@ -2356,7 +3166,7 @@
         </w:rPr>
         <w:t xml:space="preserve">Uno de los grandes problemas de la EPH es la creciente cantidad de hogares que no reportan sus ingresos (ver por ejemplo el siguiente </w:t>
       </w:r>
-      <w:hyperlink r:id="rId10">
+      <w:hyperlink r:id="rId14">
         <w:r>
           <w:rPr>
             <w:rFonts w:ascii="Century Schoolbook" w:eastAsia="Century Schoolbook" w:hAnsi="Century Schoolbook" w:cs="Century Schoolbook"/>
@@ -2884,7 +3694,7 @@
                     </pic:cNvPicPr>
                   </pic:nvPicPr>
                   <pic:blipFill>
-                    <a:blip r:embed="rId11">
+                    <a:blip r:embed="rId15">
                       <a:extLst>
                         <a:ext uri="{28A0092B-C50C-407E-A947-70E740481C1C}">
                           <a14:useLocalDpi xmlns:a14="http://schemas.microsoft.com/office/drawing/2010/main" val="0"/>
@@ -3039,7 +3849,6 @@
           <w:rFonts w:ascii="Century Schoolbook" w:eastAsia="Century Schoolbook" w:hAnsi="Century Schoolbook" w:cs="Century Schoolbook"/>
           <w:lang w:val="es-US"/>
         </w:rPr>
-        <w:lastRenderedPageBreak/>
         <w:t xml:space="preserve"> Muestren estadísticas descriptivas relevantes de </w:t>
       </w:r>
       <w:r>
@@ -3137,7 +3946,7 @@
                     </pic:cNvPicPr>
                   </pic:nvPicPr>
                   <pic:blipFill>
-                    <a:blip r:embed="rId12" cstate="print">
+                    <a:blip r:embed="rId16" cstate="print">
                       <a:extLst>
                         <a:ext uri="{28A0092B-C50C-407E-A947-70E740481C1C}">
                           <a14:useLocalDpi xmlns:a14="http://schemas.microsoft.com/office/drawing/2010/main" val="0"/>
@@ -3233,6 +4042,7 @@
       <w:r>
         <w:rPr>
           <w:rFonts w:ascii="Century Schoolbook" w:eastAsia="Century Schoolbook" w:hAnsi="Century Schoolbook" w:cs="Century Schoolbook"/>
+          <w:noProof/>
           <w:lang w:val="es-US"/>
         </w:rPr>
         <w:drawing>
@@ -3261,7 +4071,7 @@
                     </pic:cNvPicPr>
                   </pic:nvPicPr>
                   <pic:blipFill>
-                    <a:blip r:embed="rId13">
+                    <a:blip r:embed="rId17">
                       <a:extLst>
                         <a:ext uri="{28A0092B-C50C-407E-A947-70E740481C1C}">
                           <a14:useLocalDpi xmlns:a14="http://schemas.microsoft.com/office/drawing/2010/main" val="0"/>
@@ -3301,6 +4111,7 @@
       <w:r>
         <w:rPr>
           <w:rFonts w:ascii="Century Schoolbook" w:eastAsia="Century Schoolbook" w:hAnsi="Century Schoolbook" w:cs="Century Schoolbook"/>
+          <w:noProof/>
           <w:lang w:val="es-US"/>
         </w:rPr>
         <w:drawing>
@@ -3329,7 +4140,7 @@
                     </pic:cNvPicPr>
                   </pic:nvPicPr>
                   <pic:blipFill>
-                    <a:blip r:embed="rId14">
+                    <a:blip r:embed="rId18">
                       <a:extLst>
                         <a:ext uri="{28A0092B-C50C-407E-A947-70E740481C1C}">
                           <a14:useLocalDpi xmlns:a14="http://schemas.microsoft.com/office/drawing/2010/main" val="0"/>
@@ -3503,8 +4314,8 @@
       </w:pPr>
     </w:p>
     <w:sectPr>
-      <w:headerReference w:type="default" r:id="rId15"/>
-      <w:footerReference w:type="default" r:id="rId16"/>
+      <w:headerReference w:type="default" r:id="rId19"/>
+      <w:footerReference w:type="default" r:id="rId20"/>
       <w:pgSz w:w="11900" w:h="16840"/>
       <w:pgMar w:top="1412" w:right="1627" w:bottom="1319" w:left="1701" w:header="720" w:footer="720" w:gutter="0"/>
       <w:cols w:space="720"/>
@@ -4411,6 +5222,155 @@
     </w:lvl>
   </w:abstractNum>
   <w:abstractNum w:abstractNumId="2" w15:restartNumberingAfterBreak="0">
+    <w:nsid w:val="1F0B18BE"/>
+    <w:multiLevelType w:val="multilevel"/>
+    <w:tmpl w:val="F0768284"/>
+    <w:lvl w:ilvl="0">
+      <w:start w:val="1"/>
+      <w:numFmt w:val="bullet"/>
+      <w:lvlText w:val=""/>
+      <w:lvlJc w:val="left"/>
+      <w:pPr>
+        <w:tabs>
+          <w:tab w:val="num" w:pos="720"/>
+        </w:tabs>
+        <w:ind w:left="720" w:hanging="360"/>
+      </w:pPr>
+      <w:rPr>
+        <w:rFonts w:ascii="Symbol" w:hAnsi="Symbol" w:hint="default"/>
+        <w:sz w:val="20"/>
+      </w:rPr>
+    </w:lvl>
+    <w:lvl w:ilvl="1" w:tentative="1">
+      <w:start w:val="1"/>
+      <w:numFmt w:val="bullet"/>
+      <w:lvlText w:val="o"/>
+      <w:lvlJc w:val="left"/>
+      <w:pPr>
+        <w:tabs>
+          <w:tab w:val="num" w:pos="1440"/>
+        </w:tabs>
+        <w:ind w:left="1440" w:hanging="360"/>
+      </w:pPr>
+      <w:rPr>
+        <w:rFonts w:ascii="Courier New" w:hAnsi="Courier New" w:hint="default"/>
+        <w:sz w:val="20"/>
+      </w:rPr>
+    </w:lvl>
+    <w:lvl w:ilvl="2" w:tentative="1">
+      <w:start w:val="1"/>
+      <w:numFmt w:val="bullet"/>
+      <w:lvlText w:val=""/>
+      <w:lvlJc w:val="left"/>
+      <w:pPr>
+        <w:tabs>
+          <w:tab w:val="num" w:pos="2160"/>
+        </w:tabs>
+        <w:ind w:left="2160" w:hanging="360"/>
+      </w:pPr>
+      <w:rPr>
+        <w:rFonts w:ascii="Wingdings" w:hAnsi="Wingdings" w:hint="default"/>
+        <w:sz w:val="20"/>
+      </w:rPr>
+    </w:lvl>
+    <w:lvl w:ilvl="3" w:tentative="1">
+      <w:start w:val="1"/>
+      <w:numFmt w:val="bullet"/>
+      <w:lvlText w:val=""/>
+      <w:lvlJc w:val="left"/>
+      <w:pPr>
+        <w:tabs>
+          <w:tab w:val="num" w:pos="2880"/>
+        </w:tabs>
+        <w:ind w:left="2880" w:hanging="360"/>
+      </w:pPr>
+      <w:rPr>
+        <w:rFonts w:ascii="Wingdings" w:hAnsi="Wingdings" w:hint="default"/>
+        <w:sz w:val="20"/>
+      </w:rPr>
+    </w:lvl>
+    <w:lvl w:ilvl="4" w:tentative="1">
+      <w:start w:val="1"/>
+      <w:numFmt w:val="bullet"/>
+      <w:lvlText w:val=""/>
+      <w:lvlJc w:val="left"/>
+      <w:pPr>
+        <w:tabs>
+          <w:tab w:val="num" w:pos="3600"/>
+        </w:tabs>
+        <w:ind w:left="3600" w:hanging="360"/>
+      </w:pPr>
+      <w:rPr>
+        <w:rFonts w:ascii="Wingdings" w:hAnsi="Wingdings" w:hint="default"/>
+        <w:sz w:val="20"/>
+      </w:rPr>
+    </w:lvl>
+    <w:lvl w:ilvl="5" w:tentative="1">
+      <w:start w:val="1"/>
+      <w:numFmt w:val="bullet"/>
+      <w:lvlText w:val=""/>
+      <w:lvlJc w:val="left"/>
+      <w:pPr>
+        <w:tabs>
+          <w:tab w:val="num" w:pos="4320"/>
+        </w:tabs>
+        <w:ind w:left="4320" w:hanging="360"/>
+      </w:pPr>
+      <w:rPr>
+        <w:rFonts w:ascii="Wingdings" w:hAnsi="Wingdings" w:hint="default"/>
+        <w:sz w:val="20"/>
+      </w:rPr>
+    </w:lvl>
+    <w:lvl w:ilvl="6" w:tentative="1">
+      <w:start w:val="1"/>
+      <w:numFmt w:val="bullet"/>
+      <w:lvlText w:val=""/>
+      <w:lvlJc w:val="left"/>
+      <w:pPr>
+        <w:tabs>
+          <w:tab w:val="num" w:pos="5040"/>
+        </w:tabs>
+        <w:ind w:left="5040" w:hanging="360"/>
+      </w:pPr>
+      <w:rPr>
+        <w:rFonts w:ascii="Wingdings" w:hAnsi="Wingdings" w:hint="default"/>
+        <w:sz w:val="20"/>
+      </w:rPr>
+    </w:lvl>
+    <w:lvl w:ilvl="7" w:tentative="1">
+      <w:start w:val="1"/>
+      <w:numFmt w:val="bullet"/>
+      <w:lvlText w:val=""/>
+      <w:lvlJc w:val="left"/>
+      <w:pPr>
+        <w:tabs>
+          <w:tab w:val="num" w:pos="5760"/>
+        </w:tabs>
+        <w:ind w:left="5760" w:hanging="360"/>
+      </w:pPr>
+      <w:rPr>
+        <w:rFonts w:ascii="Wingdings" w:hAnsi="Wingdings" w:hint="default"/>
+        <w:sz w:val="20"/>
+      </w:rPr>
+    </w:lvl>
+    <w:lvl w:ilvl="8" w:tentative="1">
+      <w:start w:val="1"/>
+      <w:numFmt w:val="bullet"/>
+      <w:lvlText w:val=""/>
+      <w:lvlJc w:val="left"/>
+      <w:pPr>
+        <w:tabs>
+          <w:tab w:val="num" w:pos="6480"/>
+        </w:tabs>
+        <w:ind w:left="6480" w:hanging="360"/>
+      </w:pPr>
+      <w:rPr>
+        <w:rFonts w:ascii="Wingdings" w:hAnsi="Wingdings" w:hint="default"/>
+        <w:sz w:val="20"/>
+      </w:rPr>
+    </w:lvl>
+  </w:abstractNum>
+  <w:abstractNum w:abstractNumId="3" w15:restartNumberingAfterBreak="0">
     <w:nsid w:val="27A17DA1"/>
     <w:multiLevelType w:val="multilevel"/>
     <w:tmpl w:val="D96C9ACC"/>
@@ -4559,7 +5519,7 @@
       </w:rPr>
     </w:lvl>
   </w:abstractNum>
-  <w:abstractNum w:abstractNumId="3" w15:restartNumberingAfterBreak="0">
+  <w:abstractNum w:abstractNumId="4" w15:restartNumberingAfterBreak="0">
     <w:nsid w:val="27BC0E28"/>
     <w:multiLevelType w:val="multilevel"/>
     <w:tmpl w:val="92A0716C"/>
@@ -4708,7 +5668,7 @@
       </w:rPr>
     </w:lvl>
   </w:abstractNum>
-  <w:abstractNum w:abstractNumId="4" w15:restartNumberingAfterBreak="0">
+  <w:abstractNum w:abstractNumId="5" w15:restartNumberingAfterBreak="0">
     <w:nsid w:val="3D0523F9"/>
     <w:multiLevelType w:val="multilevel"/>
     <w:tmpl w:val="65FE5BF0"/>
@@ -4821,7 +5781,156 @@
       </w:rPr>
     </w:lvl>
   </w:abstractNum>
-  <w:abstractNum w:abstractNumId="5" w15:restartNumberingAfterBreak="0">
+  <w:abstractNum w:abstractNumId="6" w15:restartNumberingAfterBreak="0">
+    <w:nsid w:val="4B705F2D"/>
+    <w:multiLevelType w:val="multilevel"/>
+    <w:tmpl w:val="0C0A5FA8"/>
+    <w:lvl w:ilvl="0">
+      <w:start w:val="1"/>
+      <w:numFmt w:val="bullet"/>
+      <w:lvlText w:val=""/>
+      <w:lvlJc w:val="left"/>
+      <w:pPr>
+        <w:tabs>
+          <w:tab w:val="num" w:pos="720"/>
+        </w:tabs>
+        <w:ind w:left="720" w:hanging="360"/>
+      </w:pPr>
+      <w:rPr>
+        <w:rFonts w:ascii="Symbol" w:hAnsi="Symbol" w:hint="default"/>
+        <w:sz w:val="20"/>
+      </w:rPr>
+    </w:lvl>
+    <w:lvl w:ilvl="1" w:tentative="1">
+      <w:start w:val="1"/>
+      <w:numFmt w:val="bullet"/>
+      <w:lvlText w:val="o"/>
+      <w:lvlJc w:val="left"/>
+      <w:pPr>
+        <w:tabs>
+          <w:tab w:val="num" w:pos="1440"/>
+        </w:tabs>
+        <w:ind w:left="1440" w:hanging="360"/>
+      </w:pPr>
+      <w:rPr>
+        <w:rFonts w:ascii="Courier New" w:hAnsi="Courier New" w:hint="default"/>
+        <w:sz w:val="20"/>
+      </w:rPr>
+    </w:lvl>
+    <w:lvl w:ilvl="2" w:tentative="1">
+      <w:start w:val="1"/>
+      <w:numFmt w:val="bullet"/>
+      <w:lvlText w:val=""/>
+      <w:lvlJc w:val="left"/>
+      <w:pPr>
+        <w:tabs>
+          <w:tab w:val="num" w:pos="2160"/>
+        </w:tabs>
+        <w:ind w:left="2160" w:hanging="360"/>
+      </w:pPr>
+      <w:rPr>
+        <w:rFonts w:ascii="Wingdings" w:hAnsi="Wingdings" w:hint="default"/>
+        <w:sz w:val="20"/>
+      </w:rPr>
+    </w:lvl>
+    <w:lvl w:ilvl="3" w:tentative="1">
+      <w:start w:val="1"/>
+      <w:numFmt w:val="bullet"/>
+      <w:lvlText w:val=""/>
+      <w:lvlJc w:val="left"/>
+      <w:pPr>
+        <w:tabs>
+          <w:tab w:val="num" w:pos="2880"/>
+        </w:tabs>
+        <w:ind w:left="2880" w:hanging="360"/>
+      </w:pPr>
+      <w:rPr>
+        <w:rFonts w:ascii="Wingdings" w:hAnsi="Wingdings" w:hint="default"/>
+        <w:sz w:val="20"/>
+      </w:rPr>
+    </w:lvl>
+    <w:lvl w:ilvl="4" w:tentative="1">
+      <w:start w:val="1"/>
+      <w:numFmt w:val="bullet"/>
+      <w:lvlText w:val=""/>
+      <w:lvlJc w:val="left"/>
+      <w:pPr>
+        <w:tabs>
+          <w:tab w:val="num" w:pos="3600"/>
+        </w:tabs>
+        <w:ind w:left="3600" w:hanging="360"/>
+      </w:pPr>
+      <w:rPr>
+        <w:rFonts w:ascii="Wingdings" w:hAnsi="Wingdings" w:hint="default"/>
+        <w:sz w:val="20"/>
+      </w:rPr>
+    </w:lvl>
+    <w:lvl w:ilvl="5" w:tentative="1">
+      <w:start w:val="1"/>
+      <w:numFmt w:val="bullet"/>
+      <w:lvlText w:val=""/>
+      <w:lvlJc w:val="left"/>
+      <w:pPr>
+        <w:tabs>
+          <w:tab w:val="num" w:pos="4320"/>
+        </w:tabs>
+        <w:ind w:left="4320" w:hanging="360"/>
+      </w:pPr>
+      <w:rPr>
+        <w:rFonts w:ascii="Wingdings" w:hAnsi="Wingdings" w:hint="default"/>
+        <w:sz w:val="20"/>
+      </w:rPr>
+    </w:lvl>
+    <w:lvl w:ilvl="6" w:tentative="1">
+      <w:start w:val="1"/>
+      <w:numFmt w:val="bullet"/>
+      <w:lvlText w:val=""/>
+      <w:lvlJc w:val="left"/>
+      <w:pPr>
+        <w:tabs>
+          <w:tab w:val="num" w:pos="5040"/>
+        </w:tabs>
+        <w:ind w:left="5040" w:hanging="360"/>
+      </w:pPr>
+      <w:rPr>
+        <w:rFonts w:ascii="Wingdings" w:hAnsi="Wingdings" w:hint="default"/>
+        <w:sz w:val="20"/>
+      </w:rPr>
+    </w:lvl>
+    <w:lvl w:ilvl="7" w:tentative="1">
+      <w:start w:val="1"/>
+      <w:numFmt w:val="bullet"/>
+      <w:lvlText w:val=""/>
+      <w:lvlJc w:val="left"/>
+      <w:pPr>
+        <w:tabs>
+          <w:tab w:val="num" w:pos="5760"/>
+        </w:tabs>
+        <w:ind w:left="5760" w:hanging="360"/>
+      </w:pPr>
+      <w:rPr>
+        <w:rFonts w:ascii="Wingdings" w:hAnsi="Wingdings" w:hint="default"/>
+        <w:sz w:val="20"/>
+      </w:rPr>
+    </w:lvl>
+    <w:lvl w:ilvl="8" w:tentative="1">
+      <w:start w:val="1"/>
+      <w:numFmt w:val="bullet"/>
+      <w:lvlText w:val=""/>
+      <w:lvlJc w:val="left"/>
+      <w:pPr>
+        <w:tabs>
+          <w:tab w:val="num" w:pos="6480"/>
+        </w:tabs>
+        <w:ind w:left="6480" w:hanging="360"/>
+      </w:pPr>
+      <w:rPr>
+        <w:rFonts w:ascii="Wingdings" w:hAnsi="Wingdings" w:hint="default"/>
+        <w:sz w:val="20"/>
+      </w:rPr>
+    </w:lvl>
+  </w:abstractNum>
+  <w:abstractNum w:abstractNumId="7" w15:restartNumberingAfterBreak="0">
     <w:nsid w:val="5DFD6E27"/>
     <w:multiLevelType w:val="multilevel"/>
     <w:tmpl w:val="32D21CD6"/>
@@ -4907,7 +6016,7 @@
       </w:pPr>
     </w:lvl>
   </w:abstractNum>
-  <w:abstractNum w:abstractNumId="6" w15:restartNumberingAfterBreak="0">
+  <w:abstractNum w:abstractNumId="8" w15:restartNumberingAfterBreak="0">
     <w:nsid w:val="6A161976"/>
     <w:multiLevelType w:val="multilevel"/>
     <w:tmpl w:val="FC7230AC"/>
@@ -5056,7 +6165,7 @@
       </w:rPr>
     </w:lvl>
   </w:abstractNum>
-  <w:abstractNum w:abstractNumId="7" w15:restartNumberingAfterBreak="0">
+  <w:abstractNum w:abstractNumId="9" w15:restartNumberingAfterBreak="0">
     <w:nsid w:val="77595956"/>
     <w:multiLevelType w:val="multilevel"/>
     <w:tmpl w:val="16368328"/>
@@ -5205,7 +6314,7 @@
       </w:rPr>
     </w:lvl>
   </w:abstractNum>
-  <w:abstractNum w:abstractNumId="8" w15:restartNumberingAfterBreak="0">
+  <w:abstractNum w:abstractNumId="10" w15:restartNumberingAfterBreak="0">
     <w:nsid w:val="79DC40BA"/>
     <w:multiLevelType w:val="multilevel"/>
     <w:tmpl w:val="C47C830A"/>
@@ -5326,28 +6435,34 @@
     <w:abstractNumId w:val="1"/>
   </w:num>
   <w:num w:numId="2">
-    <w:abstractNumId w:val="5"/>
+    <w:abstractNumId w:val="7"/>
   </w:num>
   <w:num w:numId="3">
-    <w:abstractNumId w:val="2"/>
+    <w:abstractNumId w:val="3"/>
   </w:num>
   <w:num w:numId="4">
-    <w:abstractNumId w:val="3"/>
+    <w:abstractNumId w:val="4"/>
   </w:num>
   <w:num w:numId="5">
-    <w:abstractNumId w:val="8"/>
+    <w:abstractNumId w:val="10"/>
   </w:num>
   <w:num w:numId="6">
     <w:abstractNumId w:val="0"/>
   </w:num>
   <w:num w:numId="7">
-    <w:abstractNumId w:val="4"/>
+    <w:abstractNumId w:val="5"/>
   </w:num>
   <w:num w:numId="8">
-    <w:abstractNumId w:val="6"/>
+    <w:abstractNumId w:val="8"/>
   </w:num>
   <w:num w:numId="9">
-    <w:abstractNumId w:val="7"/>
+    <w:abstractNumId w:val="9"/>
+  </w:num>
+  <w:num w:numId="10">
+    <w:abstractNumId w:val="2"/>
+  </w:num>
+  <w:num w:numId="11">
+    <w:abstractNumId w:val="6"/>
   </w:num>
 </w:numbering>
 </file>
@@ -6421,4 +7536,16 @@
     </a:ext>
   </a:extLst>
 </a:theme>
+</file>
+
+<file path=customXml/item1.xml><?xml version="1.0" encoding="utf-8"?>
+<b:Sources xmlns:b="http://schemas.openxmlformats.org/officeDocument/2006/bibliography" xmlns="http://schemas.openxmlformats.org/officeDocument/2006/bibliography" SelectedStyle="\APASixthEditionOfficeOnline.xsl" StyleName="APA" Version="6"/>
+</file>
+
+<file path=customXml/itemProps1.xml><?xml version="1.0" encoding="utf-8"?>
+<ds:datastoreItem xmlns:ds="http://schemas.openxmlformats.org/officeDocument/2006/customXml" ds:itemID="{306E011F-2AE9-4E56-8B6F-2BCE82B8A891}">
+  <ds:schemaRefs>
+    <ds:schemaRef ds:uri="http://schemas.openxmlformats.org/officeDocument/2006/bibliography"/>
+  </ds:schemaRefs>
+</ds:datastoreItem>
 </file>
</xml_diff>